<commit_message>
docs(cv): update cv.docx and cv.pdf with latest experience and project details
</commit_message>
<xml_diff>
--- a/cv.docx
+++ b/cv.docx
@@ -4,11 +4,12 @@
   <w:body>
     <w:p>
       <w:pPr>
-        <w:spacing w:after="40"/>
         <w:jc w:val="center"/>
+        <w:spacing w:before="0" w:after="40"/>
       </w:pPr>
       <w:r>
         <w:rPr>
+          <w:rFonts w:ascii="Times New Roman" w:hAnsi="Times New Roman" w:eastAsia="Times New Roman" w:cs="Times New Roman"/>
           <w:b/>
           <w:sz w:val="48"/>
         </w:rPr>
@@ -17,15 +18,19 @@
     </w:p>
     <w:p>
       <w:pPr>
-        <w:spacing w:after="120"/>
         <w:jc w:val="center"/>
+        <w:spacing w:before="0" w:after="120"/>
       </w:pPr>
       <w:r>
+        <w:rPr>
+          <w:rFonts w:ascii="Times New Roman" w:hAnsi="Times New Roman" w:eastAsia="Times New Roman" w:cs="Times New Roman"/>
+        </w:rPr>
         <w:t xml:space="preserve">+91 8347205513  |  </w:t>
       </w:r>
       <w:hyperlink r:id="rId9">
         <w:r>
           <w:rPr>
+            <w:rStyle w:val="Style"/>
             <w:color w:val="0046B4"/>
             <w:u w:val="single"/>
           </w:rPr>
@@ -33,11 +38,31 @@
         </w:r>
       </w:hyperlink>
       <w:r>
+        <w:rPr>
+          <w:rFonts w:ascii="Times New Roman" w:hAnsi="Times New Roman" w:eastAsia="Times New Roman" w:cs="Times New Roman"/>
+        </w:rPr>
         <w:t xml:space="preserve">  |  </w:t>
       </w:r>
       <w:hyperlink r:id="rId10">
         <w:r>
           <w:rPr>
+            <w:rStyle w:val="Style"/>
+            <w:color w:val="0046B4"/>
+            <w:u w:val="single"/>
+          </w:rPr>
+          <w:t>jayeshmepani.site</w:t>
+        </w:r>
+      </w:hyperlink>
+      <w:r>
+        <w:rPr>
+          <w:rFonts w:ascii="Times New Roman" w:hAnsi="Times New Roman" w:eastAsia="Times New Roman" w:cs="Times New Roman"/>
+        </w:rPr>
+        <w:t xml:space="preserve">  |  </w:t>
+      </w:r>
+      <w:hyperlink r:id="rId11">
+        <w:r>
+          <w:rPr>
+            <w:rStyle w:val="Style"/>
             <w:color w:val="0046B4"/>
             <w:u w:val="single"/>
           </w:rPr>
@@ -45,11 +70,15 @@
         </w:r>
       </w:hyperlink>
       <w:r>
+        <w:rPr>
+          <w:rFonts w:ascii="Times New Roman" w:hAnsi="Times New Roman" w:eastAsia="Times New Roman" w:cs="Times New Roman"/>
+        </w:rPr>
         <w:t xml:space="preserve">  |  </w:t>
       </w:r>
-      <w:hyperlink r:id="rId11">
+      <w:hyperlink r:id="rId12">
         <w:r>
           <w:rPr>
+            <w:rStyle w:val="Style"/>
             <w:color w:val="0046B4"/>
             <w:u w:val="single"/>
           </w:rPr>
@@ -59,14 +88,15 @@
     </w:p>
     <w:p>
       <w:pPr>
-        <w:keepNext/>
-        <w:spacing w:before="280" w:after="80" w:line="240" w:lineRule="auto"/>
+        <w:keepNext w:val="true"/>
         <w:pBdr>
           <w:bottom w:val="single" w:sz="6" w:space="1" w:color="000000"/>
         </w:pBdr>
+        <w:spacing w:before="280" w:after="80" w:line="240" w:lineRule="auto"/>
       </w:pPr>
       <w:r>
         <w:rPr>
+          <w:rFonts w:ascii="Times New Roman" w:hAnsi="Times New Roman" w:eastAsia="Times New Roman" w:cs="Times New Roman"/>
           <w:b/>
           <w:sz w:val="24"/>
         </w:rPr>
@@ -75,23 +105,27 @@
     </w:p>
     <w:p>
       <w:pPr>
-        <w:spacing w:after="120" w:line="240" w:lineRule="auto"/>
-        <w:ind w:left="0"/>
+        <w:spacing w:before="0" w:after="120" w:line="240" w:lineRule="auto"/>
+        <w:ind w:start="0"/>
       </w:pPr>
       <w:r>
-        <w:t>Full-stack developer and Computer Science graduate with hands-on experience in web development, mobile development and data science. Proven track record building high-precision computation engines and open-source libraries published on Packagist and PyPI. Adept at delivering clean, maintainable code and integrating AI APIs into production systems.</w:t>
+        <w:rPr>
+          <w:rFonts w:ascii="Times New Roman" w:hAnsi="Times New Roman" w:eastAsia="Times New Roman" w:cs="Times New Roman"/>
+        </w:rPr>
+        <w:t>Versatile Full-Stack &amp; Systems Engineer with a B.Tech in Computer Science and deep expertise spanning systems-level programming, scalable backend architectures, high-performance computing, and cross-runtime integration. Proven track record designing and publishing production-grade open-source libraries, building high-throughput distributed APIs, and architecting data-intensive and intelligent software solutions. Strong foundation in software engineering fundamentals, dedicated to building performant, secure, and resilient systems from low-level runtimes to modern cloud and web platforms.</w:t>
       </w:r>
     </w:p>
     <w:p>
       <w:pPr>
-        <w:keepNext/>
-        <w:spacing w:before="280" w:after="80" w:line="240" w:lineRule="auto"/>
+        <w:keepNext w:val="true"/>
         <w:pBdr>
           <w:bottom w:val="single" w:sz="6" w:space="1" w:color="000000"/>
         </w:pBdr>
+        <w:spacing w:before="280" w:after="80" w:line="240" w:lineRule="auto"/>
       </w:pPr>
       <w:r>
         <w:rPr>
+          <w:rFonts w:ascii="Times New Roman" w:hAnsi="Times New Roman" w:eastAsia="Times New Roman" w:cs="Times New Roman"/>
           <w:b/>
           <w:sz w:val="24"/>
         </w:rPr>
@@ -100,11 +134,12 @@
     </w:p>
     <w:p>
       <w:pPr>
-        <w:spacing w:after="20" w:line="240" w:lineRule="auto"/>
-        <w:ind w:left="0"/>
+        <w:spacing w:before="0" w:after="20" w:line="240" w:lineRule="auto"/>
+        <w:ind w:start="0"/>
       </w:pPr>
       <w:r>
         <w:rPr>
+          <w:rFonts w:ascii="Times New Roman" w:hAnsi="Times New Roman" w:eastAsia="Times New Roman" w:cs="Times New Roman"/>
           <w:b/>
           <w:sz w:val="20"/>
         </w:rPr>
@@ -112,18 +147,41 @@
       </w:r>
       <w:r>
         <w:rPr>
+          <w:rFonts w:ascii="Times New Roman" w:hAnsi="Times New Roman" w:eastAsia="Times New Roman" w:cs="Times New Roman"/>
           <w:sz w:val="20"/>
         </w:rPr>
-        <w:t>Python, PHP, JavaScript, Java, Go, C, C++, Dart</w:t>
+        <w:t>C, C++, Rust, Python, PHP, JavaScript, TypeScript, Dart, Go, Java</w:t>
       </w:r>
     </w:p>
     <w:p>
       <w:pPr>
-        <w:spacing w:after="20" w:line="240" w:lineRule="auto"/>
-        <w:ind w:left="0"/>
+        <w:spacing w:before="0" w:after="20" w:line="240" w:lineRule="auto"/>
+        <w:ind w:start="0"/>
       </w:pPr>
       <w:r>
         <w:rPr>
+          <w:rFonts w:ascii="Times New Roman" w:hAnsi="Times New Roman" w:eastAsia="Times New Roman" w:cs="Times New Roman"/>
+          <w:b/>
+          <w:sz w:val="20"/>
+        </w:rPr>
+        <w:t xml:space="preserve">Compilers &amp; Systems: </w:t>
+      </w:r>
+      <w:r>
+        <w:rPr>
+          <w:rFonts w:ascii="Times New Roman" w:hAnsi="Times New Roman" w:eastAsia="Times New Roman" w:cs="Times New Roman"/>
+          <w:sz w:val="20"/>
+        </w:rPr>
+        <w:t>AST Parsers, FFI, Shared Libraries</w:t>
+      </w:r>
+    </w:p>
+    <w:p>
+      <w:pPr>
+        <w:spacing w:before="0" w:after="20" w:line="240" w:lineRule="auto"/>
+        <w:ind w:start="0"/>
+      </w:pPr>
+      <w:r>
+        <w:rPr>
+          <w:rFonts w:ascii="Times New Roman" w:hAnsi="Times New Roman" w:eastAsia="Times New Roman" w:cs="Times New Roman"/>
           <w:b/>
           <w:sz w:val="20"/>
         </w:rPr>
@@ -131,18 +189,20 @@
       </w:r>
       <w:r>
         <w:rPr>
+          <w:rFonts w:ascii="Times New Roman" w:hAnsi="Times New Roman" w:eastAsia="Times New Roman" w:cs="Times New Roman"/>
           <w:sz w:val="20"/>
         </w:rPr>
-        <w:t>React, Next.js, Vue.js, AngularJS, Tailwind CSS, Bootstrap, SCSS, WebGL, HTML, CSS</w:t>
+        <w:t>React, Next.js, Vue.js, AngularJS, Tailwind CSS, WebGL</w:t>
       </w:r>
     </w:p>
     <w:p>
       <w:pPr>
-        <w:spacing w:after="20" w:line="240" w:lineRule="auto"/>
-        <w:ind w:left="0"/>
+        <w:spacing w:before="0" w:after="20" w:line="240" w:lineRule="auto"/>
+        <w:ind w:start="0"/>
       </w:pPr>
       <w:r>
         <w:rPr>
+          <w:rFonts w:ascii="Times New Roman" w:hAnsi="Times New Roman" w:eastAsia="Times New Roman" w:cs="Times New Roman"/>
           <w:b/>
           <w:sz w:val="20"/>
         </w:rPr>
@@ -150,18 +210,20 @@
       </w:r>
       <w:r>
         <w:rPr>
+          <w:rFonts w:ascii="Times New Roman" w:hAnsi="Times New Roman" w:eastAsia="Times New Roman" w:cs="Times New Roman"/>
           <w:sz w:val="20"/>
         </w:rPr>
-        <w:t>Laravel, Node.js, Express.js, FastAPI, Flask, Django, JWT</w:t>
+        <w:t>Laravel, Node.js, Express.js, FastAPI, Flask, Django</w:t>
       </w:r>
     </w:p>
     <w:p>
       <w:pPr>
-        <w:spacing w:after="20" w:line="240" w:lineRule="auto"/>
-        <w:ind w:left="0"/>
+        <w:spacing w:before="0" w:after="20" w:line="240" w:lineRule="auto"/>
+        <w:ind w:start="0"/>
       </w:pPr>
       <w:r>
         <w:rPr>
+          <w:rFonts w:ascii="Times New Roman" w:hAnsi="Times New Roman" w:eastAsia="Times New Roman" w:cs="Times New Roman"/>
           <w:b/>
           <w:sz w:val="20"/>
         </w:rPr>
@@ -169,18 +231,20 @@
       </w:r>
       <w:r>
         <w:rPr>
+          <w:rFonts w:ascii="Times New Roman" w:hAnsi="Times New Roman" w:eastAsia="Times New Roman" w:cs="Times New Roman"/>
           <w:sz w:val="20"/>
         </w:rPr>
-        <w:t>MySQL, PostgreSQL, SQLite, MongoDB</w:t>
+        <w:t>PostgreSQL, MySQL, SQLite, MongoDB</w:t>
       </w:r>
     </w:p>
     <w:p>
       <w:pPr>
-        <w:spacing w:after="20" w:line="240" w:lineRule="auto"/>
-        <w:ind w:left="0"/>
+        <w:spacing w:before="0" w:after="20" w:line="240" w:lineRule="auto"/>
+        <w:ind w:start="0"/>
       </w:pPr>
       <w:r>
         <w:rPr>
+          <w:rFonts w:ascii="Times New Roman" w:hAnsi="Times New Roman" w:eastAsia="Times New Roman" w:cs="Times New Roman"/>
           <w:b/>
           <w:sz w:val="20"/>
         </w:rPr>
@@ -188,56 +252,62 @@
       </w:r>
       <w:r>
         <w:rPr>
+          <w:rFonts w:ascii="Times New Roman" w:hAnsi="Times New Roman" w:eastAsia="Times New Roman" w:cs="Times New Roman"/>
           <w:sz w:val="20"/>
         </w:rPr>
-        <w:t>Flutter, Android (WebView/Java)</w:t>
+        <w:t>Flutter, Dart, Android (Java)</w:t>
       </w:r>
     </w:p>
     <w:p>
       <w:pPr>
-        <w:spacing w:after="20" w:line="240" w:lineRule="auto"/>
-        <w:ind w:left="0"/>
+        <w:spacing w:before="0" w:after="20" w:line="240" w:lineRule="auto"/>
+        <w:ind w:start="0"/>
       </w:pPr>
       <w:r>
         <w:rPr>
+          <w:rFonts w:ascii="Times New Roman" w:hAnsi="Times New Roman" w:eastAsia="Times New Roman" w:cs="Times New Roman"/>
           <w:b/>
           <w:sz w:val="20"/>
         </w:rPr>
-        <w:t xml:space="preserve">DevOps &amp; Tools: </w:t>
+        <w:t xml:space="preserve">Cloud &amp; DevOps: </w:t>
       </w:r>
       <w:r>
         <w:rPr>
+          <w:rFonts w:ascii="Times New Roman" w:hAnsi="Times New Roman" w:eastAsia="Times New Roman" w:cs="Times New Roman"/>
           <w:sz w:val="20"/>
         </w:rPr>
-        <w:t>Git, GitHub, GitLab, Nginx, Postman, Vite, VS Code, Linux, PowerShell</w:t>
+        <w:t>Linux, Nginx, GitLab CI, Render, Vercel</w:t>
       </w:r>
     </w:p>
     <w:p>
       <w:pPr>
-        <w:spacing w:after="20" w:line="240" w:lineRule="auto"/>
-        <w:ind w:left="0"/>
+        <w:spacing w:before="0" w:after="20" w:line="240" w:lineRule="auto"/>
+        <w:ind w:start="0"/>
       </w:pPr>
       <w:r>
         <w:rPr>
+          <w:rFonts w:ascii="Times New Roman" w:hAnsi="Times New Roman" w:eastAsia="Times New Roman" w:cs="Times New Roman"/>
           <w:b/>
           <w:sz w:val="20"/>
         </w:rPr>
-        <w:t xml:space="preserve">AI/ML &amp; Data Science: </w:t>
+        <w:t xml:space="preserve">AI &amp; Data Science: </w:t>
       </w:r>
       <w:r>
         <w:rPr>
+          <w:rFonts w:ascii="Times New Roman" w:hAnsi="Times New Roman" w:eastAsia="Times New Roman" w:cs="Times New Roman"/>
           <w:sz w:val="20"/>
         </w:rPr>
-        <w:t>PyTorch, TensorFlow, Keras, OpenCV, scikit-learn, Pandas, HuggingFace, NLP</w:t>
+        <w:t>Deep Learning (PyTorch, TensorFlow), NLP, Computer Vision, Scikit-learn</w:t>
       </w:r>
     </w:p>
     <w:p>
       <w:pPr>
-        <w:spacing w:after="20" w:line="240" w:lineRule="auto"/>
-        <w:ind w:left="0"/>
+        <w:spacing w:before="0" w:after="20" w:line="240" w:lineRule="auto"/>
+        <w:ind w:start="0"/>
       </w:pPr>
       <w:r>
         <w:rPr>
+          <w:rFonts w:ascii="Times New Roman" w:hAnsi="Times New Roman" w:eastAsia="Times New Roman" w:cs="Times New Roman"/>
           <w:b/>
           <w:sz w:val="20"/>
         </w:rPr>
@@ -245,6 +315,7 @@
       </w:r>
       <w:r>
         <w:rPr>
+          <w:rFonts w:ascii="Times New Roman" w:hAnsi="Times New Roman" w:eastAsia="Times New Roman" w:cs="Times New Roman"/>
           <w:sz w:val="20"/>
         </w:rPr>
         <w:t>Stable Diffusion, GFPGAN, RealESRGAN, CodeFormer, UVR</w:t>
@@ -252,52 +323,36 @@
     </w:p>
     <w:p>
       <w:pPr>
-        <w:spacing w:after="20" w:line="240" w:lineRule="auto"/>
-        <w:ind w:left="0"/>
+        <w:spacing w:before="0" w:after="20" w:line="240" w:lineRule="auto"/>
+        <w:ind w:start="0"/>
       </w:pPr>
       <w:r>
         <w:rPr>
+          <w:rFonts w:ascii="Times New Roman" w:hAnsi="Times New Roman" w:eastAsia="Times New Roman" w:cs="Times New Roman"/>
           <w:b/>
           <w:sz w:val="20"/>
         </w:rPr>
-        <w:t xml:space="preserve">Design &amp; Creative: </w:t>
+        <w:t xml:space="preserve">Design: </w:t>
       </w:r>
       <w:r>
         <w:rPr>
+          <w:rFonts w:ascii="Times New Roman" w:hAnsi="Times New Roman" w:eastAsia="Times New Roman" w:cs="Times New Roman"/>
           <w:sz w:val="20"/>
         </w:rPr>
-        <w:t>Figma, Adobe Creative Cloud, Canva</w:t>
+        <w:t>Figma, Adobe Creative Cloud</w:t>
       </w:r>
     </w:p>
     <w:p>
       <w:pPr>
-        <w:spacing w:after="20" w:line="240" w:lineRule="auto"/>
-        <w:ind w:left="0"/>
+        <w:keepNext w:val="true"/>
+        <w:pBdr>
+          <w:bottom w:val="single" w:sz="6" w:space="1" w:color="000000"/>
+        </w:pBdr>
+        <w:spacing w:before="280" w:after="80" w:line="240" w:lineRule="auto"/>
       </w:pPr>
       <w:r>
         <w:rPr>
-          <w:b/>
-          <w:sz w:val="20"/>
-        </w:rPr>
-        <w:t xml:space="preserve">Other: </w:t>
-      </w:r>
-      <w:r>
-        <w:rPr>
-          <w:sz w:val="20"/>
-        </w:rPr>
-        <w:t>FFI, ctypes, REST API design, SQLAlchemy, Alembic, AI API integration</w:t>
-      </w:r>
-    </w:p>
-    <w:p>
-      <w:pPr>
-        <w:keepNext/>
-        <w:spacing w:before="280" w:after="80" w:line="240" w:lineRule="auto"/>
-        <w:pBdr>
-          <w:bottom w:val="single" w:sz="6" w:space="1" w:color="000000"/>
-        </w:pBdr>
-      </w:pPr>
-      <w:r>
-        <w:rPr>
+          <w:rFonts w:ascii="Times New Roman" w:hAnsi="Times New Roman" w:eastAsia="Times New Roman" w:cs="Times New Roman"/>
           <w:b/>
           <w:sz w:val="24"/>
         </w:rPr>
@@ -306,15 +361,17 @@
     </w:p>
     <w:p>
       <w:pPr>
-        <w:keepNext/>
+        <w:keepNext w:val="true"/>
         <w:tabs>
-          <w:tab w:pos="10181" w:val="right"/>
+          <w:tab w:val="clear" w:pos="720"/>
+          <w:tab w:val="right" w:pos="10181" w:leader="none"/>
         </w:tabs>
-        <w:spacing w:before="240" w:after="0" w:line="240" w:lineRule="auto"/>
-        <w:ind w:left="0"/>
+        <w:spacing w:before="0" w:after="0" w:line="240" w:lineRule="auto"/>
+        <w:ind w:start="0"/>
       </w:pPr>
       <w:r>
         <w:rPr>
+          <w:rFonts w:ascii="Times New Roman" w:hAnsi="Times New Roman" w:eastAsia="Times New Roman" w:cs="Times New Roman"/>
           <w:b/>
         </w:rPr>
         <w:t>Shreesoftech</w:t>
@@ -324,6 +381,7 @@
       </w:r>
       <w:r>
         <w:rPr>
+          <w:rFonts w:ascii="Times New Roman" w:hAnsi="Times New Roman" w:eastAsia="Times New Roman" w:cs="Times New Roman"/>
           <w:b/>
         </w:rPr>
         <w:t>Dec 2024 – Present</w:t>
@@ -331,35 +389,74 @@
     </w:p>
     <w:p>
       <w:pPr>
-        <w:keepNext/>
+        <w:keepNext w:val="true"/>
         <w:tabs>
-          <w:tab w:pos="10181" w:val="right"/>
+          <w:tab w:val="clear" w:pos="720"/>
+          <w:tab w:val="right" w:pos="10181" w:leader="none"/>
         </w:tabs>
-        <w:spacing w:after="80" w:line="240" w:lineRule="auto"/>
-        <w:ind w:left="0"/>
+        <w:spacing w:before="0" w:after="80" w:line="240" w:lineRule="auto"/>
+        <w:ind w:start="0"/>
       </w:pPr>
       <w:r>
         <w:rPr>
+          <w:rFonts w:ascii="Times New Roman" w:hAnsi="Times New Roman" w:eastAsia="Times New Roman" w:cs="Times New Roman"/>
           <w:i/>
         </w:rPr>
         <w:t>Laravel Developer</w:t>
       </w:r>
       <w:r>
         <w:tab/>
+      </w:r>
+      <w:r>
+        <w:rPr>
+          <w:rFonts w:ascii="Times New Roman" w:hAnsi="Times New Roman" w:eastAsia="Times New Roman" w:cs="Times New Roman"/>
+        </w:rPr>
         <w:t>Hybrid</w:t>
       </w:r>
     </w:p>
     <w:p>
       <w:pPr>
-        <w:keepNext/>
-        <w:tabs>
-          <w:tab w:pos="10181" w:val="right"/>
-        </w:tabs>
-        <w:spacing w:before="240" w:after="0" w:line="240" w:lineRule="auto"/>
-        <w:ind w:left="0"/>
+        <w:spacing w:before="0" w:after="40" w:line="240" w:lineRule="auto"/>
+        <w:ind w:start="360" w:hanging="216"/>
       </w:pPr>
       <w:r>
         <w:rPr>
+          <w:rFonts w:ascii="Times New Roman" w:hAnsi="Times New Roman" w:eastAsia="Times New Roman" w:cs="Times New Roman"/>
+          <w:sz w:val="20"/>
+        </w:rPr>
+        <w:t>•</w:t>
+        <w:tab/>
+        <w:t>Engineered production web architectures with Laravel, optimizing complex database workflows, Eloquent ORM queries, and RESTful API endpoints.</w:t>
+      </w:r>
+    </w:p>
+    <w:p>
+      <w:pPr>
+        <w:spacing w:before="0" w:after="40" w:line="240" w:lineRule="auto"/>
+        <w:ind w:start="360" w:hanging="216"/>
+      </w:pPr>
+      <w:r>
+        <w:rPr>
+          <w:rFonts w:ascii="Times New Roman" w:hAnsi="Times New Roman" w:eastAsia="Times New Roman" w:cs="Times New Roman"/>
+          <w:sz w:val="20"/>
+        </w:rPr>
+        <w:t>•</w:t>
+        <w:tab/>
+        <w:t>Implemented secure backend services, database migrations, and caching layers to ensure high availability and robust performance.</w:t>
+      </w:r>
+    </w:p>
+    <w:p>
+      <w:pPr>
+        <w:keepNext w:val="true"/>
+        <w:tabs>
+          <w:tab w:val="clear" w:pos="720"/>
+          <w:tab w:val="right" w:pos="10181" w:leader="none"/>
+        </w:tabs>
+        <w:spacing w:before="240" w:after="0" w:line="240" w:lineRule="auto"/>
+        <w:ind w:start="0"/>
+      </w:pPr>
+      <w:r>
+        <w:rPr>
+          <w:rFonts w:ascii="Times New Roman" w:hAnsi="Times New Roman" w:eastAsia="Times New Roman" w:cs="Times New Roman"/>
           <w:b/>
         </w:rPr>
         <w:t>WRTeam</w:t>
@@ -369,6 +466,7 @@
       </w:r>
       <w:r>
         <w:rPr>
+          <w:rFonts w:ascii="Times New Roman" w:hAnsi="Times New Roman" w:eastAsia="Times New Roman" w:cs="Times New Roman"/>
           <w:b/>
         </w:rPr>
         <w:t>May 2024 – June 2024</w:t>
@@ -376,63 +474,74 @@
     </w:p>
     <w:p>
       <w:pPr>
-        <w:keepNext/>
+        <w:keepNext w:val="true"/>
         <w:tabs>
-          <w:tab w:pos="10181" w:val="right"/>
+          <w:tab w:val="clear" w:pos="720"/>
+          <w:tab w:val="right" w:pos="10181" w:leader="none"/>
         </w:tabs>
-        <w:spacing w:after="80" w:line="240" w:lineRule="auto"/>
-        <w:ind w:left="0"/>
+        <w:spacing w:before="0" w:after="80" w:line="240" w:lineRule="auto"/>
+        <w:ind w:start="0"/>
       </w:pPr>
       <w:r>
         <w:rPr>
+          <w:rFonts w:ascii="Times New Roman" w:hAnsi="Times New Roman" w:eastAsia="Times New Roman" w:cs="Times New Roman"/>
           <w:i/>
         </w:rPr>
         <w:t>PHP Developer Intern</w:t>
       </w:r>
       <w:r>
         <w:tab/>
+      </w:r>
+      <w:r>
+        <w:rPr>
+          <w:rFonts w:ascii="Times New Roman" w:hAnsi="Times New Roman" w:eastAsia="Times New Roman" w:cs="Times New Roman"/>
+        </w:rPr>
         <w:t>Remote</w:t>
       </w:r>
     </w:p>
     <w:p>
       <w:pPr>
-        <w:spacing w:after="40" w:before="0" w:line="240" w:lineRule="auto"/>
-        <w:ind w:left="360" w:hanging="216"/>
+        <w:spacing w:before="0" w:after="40" w:line="240" w:lineRule="auto"/>
+        <w:ind w:start="360" w:hanging="216"/>
       </w:pPr>
       <w:r>
         <w:rPr>
+          <w:rFonts w:ascii="Times New Roman" w:hAnsi="Times New Roman" w:eastAsia="Times New Roman" w:cs="Times New Roman"/>
           <w:sz w:val="20"/>
         </w:rPr>
         <w:t>•</w:t>
         <w:tab/>
-        <w:t>Engineered and maintained a PHP web application, improving codebase efficiency by 50%+ through dynamic fetching optimizations that significantly reduced file count and code volume.</w:t>
+        <w:t>Engineered and tested PHP web applications, improving codebase efficiency by 50%+ through dynamic fetching optimizations that significantly reduced file count and code volume.</w:t>
       </w:r>
     </w:p>
     <w:p>
       <w:pPr>
-        <w:spacing w:after="40" w:before="0" w:line="240" w:lineRule="auto"/>
-        <w:ind w:left="360" w:hanging="216"/>
+        <w:spacing w:before="0" w:after="40" w:line="240" w:lineRule="auto"/>
+        <w:ind w:start="360" w:hanging="216"/>
       </w:pPr>
       <w:r>
         <w:rPr>
+          <w:rFonts w:ascii="Times New Roman" w:hAnsi="Times New Roman" w:eastAsia="Times New Roman" w:cs="Times New Roman"/>
           <w:sz w:val="20"/>
         </w:rPr>
         <w:t>•</w:t>
         <w:tab/>
-        <w:t>Collaborated on integrating front-end and back-end systems, accelerating delivery timelines.</w:t>
+        <w:t>Built secure API endpoints and collaborated on cross-functional agile teams to deliver commercial client solutions.</w:t>
       </w:r>
     </w:p>
     <w:p>
       <w:pPr>
-        <w:keepNext/>
+        <w:keepNext w:val="true"/>
         <w:tabs>
-          <w:tab w:pos="10181" w:val="right"/>
+          <w:tab w:val="clear" w:pos="720"/>
+          <w:tab w:val="right" w:pos="10181" w:leader="none"/>
         </w:tabs>
         <w:spacing w:before="240" w:after="0" w:line="240" w:lineRule="auto"/>
-        <w:ind w:left="0"/>
+        <w:ind w:start="0"/>
       </w:pPr>
       <w:r>
         <w:rPr>
+          <w:rFonts w:ascii="Times New Roman" w:hAnsi="Times New Roman" w:eastAsia="Times New Roman" w:cs="Times New Roman"/>
           <w:b/>
         </w:rPr>
         <w:t>CodSoft</w:t>
@@ -442,6 +551,7 @@
       </w:r>
       <w:r>
         <w:rPr>
+          <w:rFonts w:ascii="Times New Roman" w:hAnsi="Times New Roman" w:eastAsia="Times New Roman" w:cs="Times New Roman"/>
           <w:b/>
         </w:rPr>
         <w:t>Jun 2024 – Jul 2024</w:t>
@@ -449,45 +559,54 @@
     </w:p>
     <w:p>
       <w:pPr>
-        <w:keepNext/>
+        <w:keepNext w:val="true"/>
         <w:tabs>
-          <w:tab w:pos="10181" w:val="right"/>
+          <w:tab w:val="clear" w:pos="720"/>
+          <w:tab w:val="right" w:pos="10181" w:leader="none"/>
         </w:tabs>
-        <w:spacing w:after="80" w:line="240" w:lineRule="auto"/>
-        <w:ind w:left="0"/>
+        <w:spacing w:before="0" w:after="80" w:line="240" w:lineRule="auto"/>
+        <w:ind w:start="0"/>
       </w:pPr>
       <w:r>
         <w:rPr>
+          <w:rFonts w:ascii="Times New Roman" w:hAnsi="Times New Roman" w:eastAsia="Times New Roman" w:cs="Times New Roman"/>
           <w:i/>
         </w:rPr>
         <w:t>Flutter Developer Intern</w:t>
       </w:r>
       <w:r>
         <w:tab/>
+      </w:r>
+      <w:r>
+        <w:rPr>
+          <w:rFonts w:ascii="Times New Roman" w:hAnsi="Times New Roman" w:eastAsia="Times New Roman" w:cs="Times New Roman"/>
+        </w:rPr>
         <w:t>Remote</w:t>
       </w:r>
     </w:p>
     <w:p>
       <w:pPr>
-        <w:spacing w:after="40" w:before="0" w:line="240" w:lineRule="auto"/>
-        <w:ind w:left="360" w:hanging="216"/>
+        <w:spacing w:before="0" w:after="40" w:line="240" w:lineRule="auto"/>
+        <w:ind w:start="360" w:hanging="216"/>
       </w:pPr>
       <w:r>
         <w:rPr>
+          <w:rFonts w:ascii="Times New Roman" w:hAnsi="Times New Roman" w:eastAsia="Times New Roman" w:cs="Times New Roman"/>
           <w:sz w:val="20"/>
         </w:rPr>
         <w:t>•</w:t>
         <w:tab/>
-        <w:t>Built 4 cross-platform Flutter applications covering diverse domains, enhancing user engagement through polished UI and smooth navigation.</w:t>
+        <w:t>Built 4 cross-platform mobile applications with Flutter and Dart, implementing responsive UI components, state management, and local SQLite data persistence.</w:t>
       </w:r>
     </w:p>
     <w:p>
       <w:pPr>
-        <w:spacing w:after="40" w:before="0" w:line="240" w:lineRule="auto"/>
-        <w:ind w:left="360" w:hanging="216"/>
+        <w:spacing w:before="0" w:after="40" w:line="240" w:lineRule="auto"/>
+        <w:ind w:start="360" w:hanging="216"/>
       </w:pPr>
       <w:r>
         <w:rPr>
+          <w:rFonts w:ascii="Times New Roman" w:hAnsi="Times New Roman" w:eastAsia="Times New Roman" w:cs="Times New Roman"/>
           <w:sz w:val="20"/>
         </w:rPr>
         <w:t>•</w:t>
@@ -497,15 +616,17 @@
     </w:p>
     <w:p>
       <w:pPr>
-        <w:keepNext/>
+        <w:keepNext w:val="true"/>
         <w:tabs>
-          <w:tab w:pos="10181" w:val="right"/>
+          <w:tab w:val="clear" w:pos="720"/>
+          <w:tab w:val="right" w:pos="10181" w:leader="none"/>
         </w:tabs>
         <w:spacing w:before="240" w:after="0" w:line="240" w:lineRule="auto"/>
-        <w:ind w:left="0"/>
+        <w:ind w:start="0"/>
       </w:pPr>
       <w:r>
         <w:rPr>
+          <w:rFonts w:ascii="Times New Roman" w:hAnsi="Times New Roman" w:eastAsia="Times New Roman" w:cs="Times New Roman"/>
           <w:b/>
         </w:rPr>
         <w:t>CodSoft</w:t>
@@ -515,6 +636,7 @@
       </w:r>
       <w:r>
         <w:rPr>
+          <w:rFonts w:ascii="Times New Roman" w:hAnsi="Times New Roman" w:eastAsia="Times New Roman" w:cs="Times New Roman"/>
           <w:b/>
         </w:rPr>
         <w:t>May 2024 – Jun 2024</w:t>
@@ -522,49 +644,59 @@
     </w:p>
     <w:p>
       <w:pPr>
-        <w:keepNext/>
+        <w:keepNext w:val="true"/>
         <w:tabs>
-          <w:tab w:pos="10181" w:val="right"/>
+          <w:tab w:val="clear" w:pos="720"/>
+          <w:tab w:val="right" w:pos="10181" w:leader="none"/>
         </w:tabs>
-        <w:spacing w:after="80" w:line="240" w:lineRule="auto"/>
-        <w:ind w:left="0"/>
+        <w:spacing w:before="0" w:after="80" w:line="240" w:lineRule="auto"/>
+        <w:ind w:start="0"/>
       </w:pPr>
       <w:r>
         <w:rPr>
+          <w:rFonts w:ascii="Times New Roman" w:hAnsi="Times New Roman" w:eastAsia="Times New Roman" w:cs="Times New Roman"/>
           <w:i/>
         </w:rPr>
         <w:t>Python Programming Intern</w:t>
       </w:r>
       <w:r>
         <w:tab/>
+      </w:r>
+      <w:r>
+        <w:rPr>
+          <w:rFonts w:ascii="Times New Roman" w:hAnsi="Times New Roman" w:eastAsia="Times New Roman" w:cs="Times New Roman"/>
+        </w:rPr>
         <w:t>Remote</w:t>
       </w:r>
     </w:p>
     <w:p>
       <w:pPr>
-        <w:spacing w:after="40" w:before="0" w:line="240" w:lineRule="auto"/>
-        <w:ind w:left="360" w:hanging="216"/>
+        <w:spacing w:before="0" w:after="40" w:line="240" w:lineRule="auto"/>
+        <w:ind w:start="360" w:hanging="216"/>
       </w:pPr>
       <w:r>
         <w:rPr>
+          <w:rFonts w:ascii="Times New Roman" w:hAnsi="Times New Roman" w:eastAsia="Times New Roman" w:cs="Times New Roman"/>
           <w:sz w:val="20"/>
         </w:rPr>
         <w:t>•</w:t>
         <w:tab/>
-        <w:t>Developed 5 Python applications spanning user management, game logic, security, arithmetic, and task management, implementing 3 new features that improved robustness by 30%.</w:t>
+        <w:t>Constructed algorithmic automation suites, object-oriented software architectures, and backend scripting solutions across 5 Python applications spanning user management, game logic, security, and task management.</w:t>
       </w:r>
     </w:p>
     <w:p>
       <w:pPr>
-        <w:keepNext/>
+        <w:keepNext w:val="true"/>
         <w:tabs>
-          <w:tab w:pos="10181" w:val="right"/>
+          <w:tab w:val="clear" w:pos="720"/>
+          <w:tab w:val="right" w:pos="10181" w:leader="none"/>
         </w:tabs>
         <w:spacing w:before="240" w:after="0" w:line="240" w:lineRule="auto"/>
-        <w:ind w:left="0"/>
+        <w:ind w:start="0"/>
       </w:pPr>
       <w:r>
         <w:rPr>
+          <w:rFonts w:ascii="Times New Roman" w:hAnsi="Times New Roman" w:eastAsia="Times New Roman" w:cs="Times New Roman"/>
           <w:b/>
         </w:rPr>
         <w:t>CodSoft</w:t>
@@ -574,6 +706,7 @@
       </w:r>
       <w:r>
         <w:rPr>
+          <w:rFonts w:ascii="Times New Roman" w:hAnsi="Times New Roman" w:eastAsia="Times New Roman" w:cs="Times New Roman"/>
           <w:b/>
         </w:rPr>
         <w:t>May 2024 – Jun 2024</w:t>
@@ -581,62 +714,57 @@
     </w:p>
     <w:p>
       <w:pPr>
-        <w:keepNext/>
+        <w:keepNext w:val="true"/>
         <w:tabs>
-          <w:tab w:pos="10181" w:val="right"/>
+          <w:tab w:val="clear" w:pos="720"/>
+          <w:tab w:val="right" w:pos="10181" w:leader="none"/>
         </w:tabs>
-        <w:spacing w:after="80" w:line="240" w:lineRule="auto"/>
-        <w:ind w:left="0"/>
+        <w:spacing w:before="0" w:after="80" w:line="240" w:lineRule="auto"/>
+        <w:ind w:start="0"/>
       </w:pPr>
       <w:r>
         <w:rPr>
+          <w:rFonts w:ascii="Times New Roman" w:hAnsi="Times New Roman" w:eastAsia="Times New Roman" w:cs="Times New Roman"/>
           <w:i/>
         </w:rPr>
         <w:t>Data Science Intern</w:t>
       </w:r>
       <w:r>
         <w:tab/>
+      </w:r>
+      <w:r>
+        <w:rPr>
+          <w:rFonts w:ascii="Times New Roman" w:hAnsi="Times New Roman" w:eastAsia="Times New Roman" w:cs="Times New Roman"/>
+        </w:rPr>
         <w:t>Remote</w:t>
       </w:r>
     </w:p>
     <w:p>
       <w:pPr>
-        <w:spacing w:after="40" w:before="0" w:line="240" w:lineRule="auto"/>
-        <w:ind w:left="360" w:hanging="216"/>
+        <w:spacing w:before="0" w:after="40" w:line="240" w:lineRule="auto"/>
+        <w:ind w:start="360" w:hanging="216"/>
       </w:pPr>
       <w:r>
         <w:rPr>
+          <w:rFonts w:ascii="Times New Roman" w:hAnsi="Times New Roman" w:eastAsia="Times New Roman" w:cs="Times New Roman"/>
           <w:sz w:val="20"/>
         </w:rPr>
         <w:t>•</w:t>
         <w:tab/>
-        <w:t>Analyzed 5 datasets and produced 55 visualizations using Pandas, Matplotlib, and Seaborn to surface actionable insights.</w:t>
+        <w:t>Developed machine learning pipelines, predictive statistical modeling, and exploratory data analysis with Pandas, NumPy, and Scikit-learn across 5 datasets (55+ visualizations), achieving 85%+ model accuracy.</w:t>
       </w:r>
     </w:p>
     <w:p>
       <w:pPr>
-        <w:spacing w:after="40" w:before="0" w:line="240" w:lineRule="auto"/>
-        <w:ind w:left="360" w:hanging="216"/>
+        <w:keepNext w:val="true"/>
+        <w:pBdr>
+          <w:bottom w:val="single" w:sz="6" w:space="1" w:color="000000"/>
+        </w:pBdr>
+        <w:spacing w:before="280" w:after="80" w:line="240" w:lineRule="auto"/>
       </w:pPr>
       <w:r>
         <w:rPr>
-          <w:sz w:val="20"/>
-        </w:rPr>
-        <w:t>•</w:t>
-        <w:tab/>
-        <w:t>Trained and evaluated predictive ML models achieving 85%+ accuracy.</w:t>
-      </w:r>
-    </w:p>
-    <w:p>
-      <w:pPr>
-        <w:keepNext/>
-        <w:spacing w:before="280" w:after="80" w:line="240" w:lineRule="auto"/>
-        <w:pBdr>
-          <w:bottom w:val="single" w:sz="6" w:space="1" w:color="000000"/>
-        </w:pBdr>
-      </w:pPr>
-      <w:r>
-        <w:rPr>
+          <w:rFonts w:ascii="Times New Roman" w:hAnsi="Times New Roman" w:eastAsia="Times New Roman" w:cs="Times New Roman"/>
           <w:b/>
           <w:sz w:val="24"/>
         </w:rPr>
@@ -645,25 +773,192 @@
     </w:p>
     <w:p>
       <w:pPr>
-        <w:keepNext/>
+        <w:keepNext w:val="true"/>
         <w:tabs>
-          <w:tab w:pos="10181" w:val="right"/>
+          <w:tab w:val="clear" w:pos="720"/>
+          <w:tab w:val="right" w:pos="10181" w:leader="none"/>
         </w:tabs>
-        <w:spacing w:before="280" w:after="0" w:line="240" w:lineRule="auto"/>
-        <w:ind w:left="0"/>
+        <w:spacing w:before="0" w:after="0" w:line="240" w:lineRule="auto"/>
+        <w:ind w:start="0"/>
       </w:pPr>
       <w:r>
         <w:rPr>
+          <w:rFonts w:ascii="Times New Roman" w:hAnsi="Times New Roman" w:eastAsia="Times New Roman" w:cs="Times New Roman"/>
           <w:b/>
         </w:rPr>
-        <w:t>Panchang Core</w:t>
+        <w:t>Panchang Core &amp; JPL Ephemeris Ecosystem</w:t>
       </w:r>
       <w:r>
         <w:tab/>
       </w:r>
-      <w:hyperlink r:id="rId12">
+      <w:hyperlink r:id="rId13">
         <w:r>
           <w:rPr>
+            <w:rStyle w:val="Style"/>
+            <w:color w:val="0046B4"/>
+            <w:u w:val="single"/>
+          </w:rPr>
+          <w:t>GitHub (Core)</w:t>
+        </w:r>
+      </w:hyperlink>
+      <w:r>
+        <w:rPr>
+          <w:rFonts w:ascii="Times New Roman" w:hAnsi="Times New Roman" w:eastAsia="Times New Roman" w:cs="Times New Roman"/>
+        </w:rPr>
+        <w:t xml:space="preserve"> | </w:t>
+      </w:r>
+      <w:hyperlink r:id="rId14">
+        <w:r>
+          <w:rPr>
+            <w:rStyle w:val="Style"/>
+            <w:color w:val="0046B4"/>
+            <w:u w:val="single"/>
+          </w:rPr>
+          <w:t>GitHub (C Engine)</w:t>
+        </w:r>
+      </w:hyperlink>
+    </w:p>
+    <w:p>
+      <w:pPr>
+        <w:keepNext w:val="true"/>
+        <w:spacing w:before="0" w:after="80" w:line="240" w:lineRule="auto"/>
+        <w:ind w:start="0"/>
+      </w:pPr>
+      <w:r>
+        <w:rPr>
+          <w:rFonts w:ascii="Times New Roman" w:hAnsi="Times New Roman" w:eastAsia="Times New Roman" w:cs="Times New Roman"/>
+          <w:i/>
+          <w:sz w:val="20"/>
+        </w:rPr>
+        <w:t>C, CALCEPH, JPL DE440, PHP ext-ffi, Python ctypes, Dart FFI</w:t>
+      </w:r>
+    </w:p>
+    <w:p>
+      <w:pPr>
+        <w:spacing w:before="0" w:after="40" w:line="240" w:lineRule="auto"/>
+        <w:ind w:start="360" w:hanging="216"/>
+      </w:pPr>
+      <w:r>
+        <w:rPr>
+          <w:rFonts w:ascii="Times New Roman" w:hAnsi="Times New Roman" w:eastAsia="Times New Roman" w:cs="Times New Roman"/>
+          <w:sz w:val="20"/>
+        </w:rPr>
+        <w:t>•</w:t>
+        <w:tab/>
+        <w:t>Architected an authentic Vedic Panchanga calculation engine powered by an independent C ephemeris engine (204 public functions, 462 constants) implementing JPL DE405/DE440, CALCEPH, Moshier, VSOP87, and ELP2000 theories.</w:t>
+      </w:r>
+    </w:p>
+    <w:p>
+      <w:pPr>
+        <w:spacing w:before="0" w:after="40" w:line="240" w:lineRule="auto"/>
+        <w:ind w:start="360" w:hanging="216"/>
+      </w:pPr>
+      <w:r>
+        <w:rPr>
+          <w:rFonts w:ascii="Times New Roman" w:hAnsi="Times New Roman" w:eastAsia="Times New Roman" w:cs="Times New Roman"/>
+          <w:sz w:val="20"/>
+        </w:rPr>
+        <w:t>•</w:t>
+        <w:tab/>
+        <w:t>Computed Tithi, Nakṣatra, Yoga, Karaṇa, and 30 Muhūrtas with 0.001 arcsecond precision, orchestrating 336 unique festival identities and 126 vrat identities across Amanta and Purnimanta calendars.</w:t>
+      </w:r>
+    </w:p>
+    <w:p>
+      <w:pPr>
+        <w:spacing w:before="0" w:after="40" w:line="240" w:lineRule="auto"/>
+        <w:ind w:start="360" w:hanging="216"/>
+      </w:pPr>
+      <w:r>
+        <w:rPr>
+          <w:rFonts w:ascii="Times New Roman" w:hAnsi="Times New Roman" w:eastAsia="Times New Roman" w:cs="Times New Roman"/>
+          <w:sz w:val="20"/>
+        </w:rPr>
+        <w:t>•</w:t>
+        <w:tab/>
+      </w:r>
+      <w:r>
+        <w:rPr>
+          <w:rFonts w:ascii="Times New Roman" w:hAnsi="Times New Roman" w:eastAsia="Times New Roman" w:cs="Times New Roman"/>
+          <w:sz w:val="20"/>
+        </w:rPr>
+        <w:t xml:space="preserve">Distributed zero-overhead FFI bindings and precompiled native binaries across </w:t>
+      </w:r>
+      <w:hyperlink r:id="rId15">
+        <w:r>
+          <w:rPr>
+            <w:rStyle w:val="Style"/>
+            <w:color w:val="0046B4"/>
+            <w:u w:val="single"/>
+          </w:rPr>
+          <w:t>PHP</w:t>
+        </w:r>
+      </w:hyperlink>
+      <w:r>
+        <w:rPr>
+          <w:rFonts w:ascii="Times New Roman" w:hAnsi="Times New Roman" w:eastAsia="Times New Roman" w:cs="Times New Roman"/>
+          <w:sz w:val="20"/>
+        </w:rPr>
+        <w:t xml:space="preserve"> (ext-ffi), </w:t>
+      </w:r>
+      <w:hyperlink r:id="rId16">
+        <w:r>
+          <w:rPr>
+            <w:rStyle w:val="Style"/>
+            <w:color w:val="0046B4"/>
+            <w:u w:val="single"/>
+          </w:rPr>
+          <w:t>Python</w:t>
+        </w:r>
+      </w:hyperlink>
+      <w:r>
+        <w:rPr>
+          <w:rFonts w:ascii="Times New Roman" w:hAnsi="Times New Roman" w:eastAsia="Times New Roman" w:cs="Times New Roman"/>
+          <w:sz w:val="20"/>
+        </w:rPr>
+        <w:t xml:space="preserve"> (ctypes), and </w:t>
+      </w:r>
+      <w:hyperlink r:id="rId17">
+        <w:r>
+          <w:rPr>
+            <w:rStyle w:val="Style"/>
+            <w:color w:val="0046B4"/>
+            <w:u w:val="single"/>
+          </w:rPr>
+          <w:t>Dart/Flutter</w:t>
+        </w:r>
+      </w:hyperlink>
+      <w:r>
+        <w:rPr>
+          <w:rFonts w:ascii="Times New Roman" w:hAnsi="Times New Roman" w:eastAsia="Times New Roman" w:cs="Times New Roman"/>
+          <w:sz w:val="20"/>
+        </w:rPr>
+        <w:t xml:space="preserve"> (dart:ffi).</w:t>
+      </w:r>
+    </w:p>
+    <w:p>
+      <w:pPr>
+        <w:keepNext w:val="true"/>
+        <w:tabs>
+          <w:tab w:val="clear" w:pos="720"/>
+          <w:tab w:val="right" w:pos="10181" w:leader="none"/>
+        </w:tabs>
+        <w:spacing w:before="280" w:after="0" w:line="240" w:lineRule="auto"/>
+        <w:ind w:start="0"/>
+      </w:pPr>
+      <w:r>
+        <w:rPr>
+          <w:rFonts w:ascii="Times New Roman" w:hAnsi="Times New Roman" w:eastAsia="Times New Roman" w:cs="Times New Roman"/>
+          <w:b/>
+        </w:rPr>
+        <w:t>CSSForge — Lossless CSS AST Refactoring Engine</w:t>
+      </w:r>
+      <w:r>
+        <w:tab/>
+      </w:r>
+      <w:hyperlink r:id="rId18">
+        <w:r>
+          <w:rPr>
+            <w:rStyle w:val="Style"/>
             <w:color w:val="0046B4"/>
             <w:u w:val="single"/>
           </w:rPr>
@@ -673,81 +968,88 @@
     </w:p>
     <w:p>
       <w:pPr>
-        <w:keepNext/>
-        <w:spacing w:after="80" w:line="240" w:lineRule="auto"/>
-        <w:ind w:left="0"/>
+        <w:keepNext w:val="true"/>
+        <w:spacing w:before="0" w:after="80" w:line="240" w:lineRule="auto"/>
+        <w:ind w:start="0"/>
       </w:pPr>
       <w:r>
         <w:rPr>
+          <w:rFonts w:ascii="Times New Roman" w:hAnsi="Times New Roman" w:eastAsia="Times New Roman" w:cs="Times New Roman"/>
           <w:i/>
           <w:sz w:val="20"/>
         </w:rPr>
-        <w:t>PHP, FFI, JME Ephemeris</w:t>
+        <w:t>Rust (Edition 2024), Ratatui TUI, AST Parser, Crates.io</w:t>
       </w:r>
     </w:p>
     <w:p>
       <w:pPr>
-        <w:spacing w:after="40" w:before="0" w:line="240" w:lineRule="auto"/>
-        <w:ind w:left="360" w:hanging="216"/>
+        <w:spacing w:before="0" w:after="40" w:line="240" w:lineRule="auto"/>
+        <w:ind w:start="360" w:hanging="216"/>
       </w:pPr>
       <w:r>
         <w:rPr>
+          <w:rFonts w:ascii="Times New Roman" w:hAnsi="Times New Roman" w:eastAsia="Times New Roman" w:cs="Times New Roman"/>
           <w:sz w:val="20"/>
         </w:rPr>
         <w:t>•</w:t>
         <w:tab/>
-        <w:t>Architected a high-precision Hindu calendar engine using a JME Ephemeris FFI bridge and IEEE 754 doubles to compute Tithi, Nakṣatra, Yoga, Karaṇa, and 30 Muhūrtas with 0.001 arcsecond accuracy.</w:t>
+        <w:t>Engineered a safety-first, lossless semantic CSS refactoring engine and interactive terminal workbench in Rust (Edition 2024), published on Crates.io.</w:t>
       </w:r>
     </w:p>
     <w:p>
       <w:pPr>
-        <w:spacing w:after="40" w:before="0" w:line="240" w:lineRule="auto"/>
-        <w:ind w:left="360" w:hanging="216"/>
+        <w:spacing w:before="0" w:after="40" w:line="240" w:lineRule="auto"/>
+        <w:ind w:start="360" w:hanging="216"/>
       </w:pPr>
       <w:r>
         <w:rPr>
+          <w:rFonts w:ascii="Times New Roman" w:hAnsi="Times New Roman" w:eastAsia="Times New Roman" w:cs="Times New Roman"/>
           <w:sz w:val="20"/>
         </w:rPr>
         <w:t>•</w:t>
         <w:tab/>
-        <w:t>Implemented KalaNirnaya logic orchestrating 323 unique festivals and 85 unique vrat identities across Amanta/Purnimanta calendars with English, Hindi, and Gujarati output.</w:t>
+        <w:t>Implemented 28 AST transformation rules modernizing flat legacy CSS into native nesting, Range media queries, @layer consolidation, and :is() factoring with zero declaration loss.</w:t>
       </w:r>
     </w:p>
     <w:p>
       <w:pPr>
-        <w:spacing w:after="40" w:before="0" w:line="240" w:lineRule="auto"/>
-        <w:ind w:left="360" w:hanging="216"/>
+        <w:spacing w:before="0" w:after="40" w:line="240" w:lineRule="auto"/>
+        <w:ind w:start="360" w:hanging="216"/>
       </w:pPr>
       <w:r>
         <w:rPr>
+          <w:rFonts w:ascii="Times New Roman" w:hAnsi="Times New Roman" w:eastAsia="Times New Roman" w:cs="Times New Roman"/>
           <w:sz w:val="20"/>
         </w:rPr>
         <w:t>•</w:t>
         <w:tab/>
-        <w:t>Designed a framework-agnostic architecture deployable as a standalone CLI or as a Laravel package via native Facades and Service Providers.</w:t>
+        <w:t>Supported raw stylesheets and embedded style blocks within Blade, Vue, Svelte, Astro, Twig, ERB, and HTML templates.</w:t>
       </w:r>
     </w:p>
     <w:p>
       <w:pPr>
-        <w:keepNext/>
+        <w:keepNext w:val="true"/>
         <w:tabs>
-          <w:tab w:pos="10181" w:val="right"/>
+          <w:tab w:val="clear" w:pos="720"/>
+          <w:tab w:val="right" w:pos="10181" w:leader="none"/>
         </w:tabs>
         <w:spacing w:before="280" w:after="0" w:line="240" w:lineRule="auto"/>
-        <w:ind w:left="0"/>
+        <w:ind w:start="0"/>
       </w:pPr>
       <w:r>
         <w:rPr>
+          <w:rFonts w:ascii="Times New Roman" w:hAnsi="Times New Roman" w:eastAsia="Times New Roman" w:cs="Times New Roman"/>
           <w:b/>
         </w:rPr>
-        <w:t>JME Ephemeris Engine</w:t>
+        <w:t>Lipimala — Deterministic Indic Script &amp; Vedic Transliteration</w:t>
       </w:r>
       <w:r>
         <w:tab/>
       </w:r>
-      <w:hyperlink r:id="rId13">
+      <w:hyperlink r:id="rId19">
         <w:r>
           <w:rPr>
+            <w:rStyle w:val="Style"/>
             <w:color w:val="0046B4"/>
             <w:u w:val="single"/>
           </w:rPr>
@@ -757,285 +1059,88 @@
     </w:p>
     <w:p>
       <w:pPr>
-        <w:keepNext/>
-        <w:spacing w:after="80" w:line="240" w:lineRule="auto"/>
-        <w:ind w:left="0"/>
+        <w:keepNext w:val="true"/>
+        <w:spacing w:before="0" w:after="80" w:line="240" w:lineRule="auto"/>
+        <w:ind w:start="0"/>
       </w:pPr>
       <w:r>
         <w:rPr>
+          <w:rFonts w:ascii="Times New Roman" w:hAnsi="Times New Roman" w:eastAsia="Times New Roman" w:cs="Times New Roman"/>
           <w:i/>
           <w:sz w:val="20"/>
         </w:rPr>
-        <w:t>C, Astronomy, JPL, CALCEPH</w:t>
+        <w:t>Dart, Node.js, Python, PHP, Unicode Vedic Tags</w:t>
       </w:r>
     </w:p>
     <w:p>
       <w:pPr>
-        <w:spacing w:after="40" w:before="0" w:line="240" w:lineRule="auto"/>
-        <w:ind w:left="360" w:hanging="216"/>
+        <w:spacing w:before="0" w:after="40" w:line="240" w:lineRule="auto"/>
+        <w:ind w:start="360" w:hanging="216"/>
       </w:pPr>
       <w:r>
         <w:rPr>
+          <w:rFonts w:ascii="Times New Roman" w:hAnsi="Times New Roman" w:eastAsia="Times New Roman" w:cs="Times New Roman"/>
           <w:sz w:val="20"/>
         </w:rPr>
         <w:t>•</w:t>
         <w:tab/>
-        <w:t>Developed an independent MIT-licensed ephemeris engine with 204 public functions and 462 constants.</w:t>
+        <w:t>Built a deterministic Indic transliteration suite published synchronously across 4 package registries: pub.dev (Dart), npm (JavaScript/TypeScript), PyPI (Python), and Packagist (PHP).</w:t>
       </w:r>
     </w:p>
     <w:p>
       <w:pPr>
-        <w:spacing w:after="40" w:before="0" w:line="240" w:lineRule="auto"/>
-        <w:ind w:left="360" w:hanging="216"/>
+        <w:spacing w:before="0" w:after="40" w:line="240" w:lineRule="auto"/>
+        <w:ind w:start="360" w:hanging="216"/>
       </w:pPr>
       <w:r>
         <w:rPr>
+          <w:rFonts w:ascii="Times New Roman" w:hAnsi="Times New Roman" w:eastAsia="Times New Roman" w:cs="Times New Roman"/>
           <w:sz w:val="20"/>
         </w:rPr>
         <w:t>•</w:t>
         <w:tab/>
-        <w:t>Implemented multiple computation backends including JPL/CALCEPH, Moshier, VSOP87, ELP2000, and Meeus.</w:t>
+        <w:t>Solved Brahmic many-to-one collapse via structured TransliterationResult envelopes and checksummed LIT1: Unicode-Tag metadata trailers.</w:t>
       </w:r>
     </w:p>
     <w:p>
       <w:pPr>
-        <w:spacing w:after="40" w:before="0" w:line="240" w:lineRule="auto"/>
-        <w:ind w:left="360" w:hanging="216"/>
+        <w:spacing w:before="0" w:after="40" w:line="240" w:lineRule="auto"/>
+        <w:ind w:start="360" w:hanging="216"/>
       </w:pPr>
       <w:r>
         <w:rPr>
+          <w:rFonts w:ascii="Times New Roman" w:hAnsi="Times New Roman" w:eastAsia="Times New Roman" w:cs="Times New Roman"/>
           <w:sz w:val="20"/>
         </w:rPr>
         <w:t>•</w:t>
         <w:tab/>
-        <w:t>Designed strict engine-selection architecture supporting JPL, MOSHIER, VSOP_ELP_MEEUS, and AUTO modes.</w:t>
+        <w:t>Enabled direct Devanagari ↔ Gujarati conversion with first-class preservation of Vedic svara markers (Udatta, Anudatta, Svarita).</w:t>
       </w:r>
     </w:p>
     <w:p>
       <w:pPr>
-        <w:spacing w:after="40" w:before="0" w:line="240" w:lineRule="auto"/>
-        <w:ind w:left="360" w:hanging="216"/>
+        <w:keepNext w:val="true"/>
+        <w:tabs>
+          <w:tab w:val="clear" w:pos="720"/>
+          <w:tab w:val="right" w:pos="10181" w:leader="none"/>
+        </w:tabs>
+        <w:spacing w:before="280" w:after="0" w:line="240" w:lineRule="auto"/>
+        <w:ind w:start="0"/>
       </w:pPr>
       <w:r>
         <w:rPr>
-          <w:sz w:val="20"/>
-        </w:rPr>
-        <w:t>•</w:t>
-        <w:tab/>
-        <w:t>Built the native foundation powering PHP, Python, and Dart language ecosystems.</w:t>
-      </w:r>
-    </w:p>
-    <w:p>
-      <w:pPr>
-        <w:keepNext/>
-        <w:tabs>
-          <w:tab w:pos="10181" w:val="right"/>
-        </w:tabs>
-        <w:spacing w:before="280" w:after="0" w:line="240" w:lineRule="auto"/>
-        <w:ind w:left="0"/>
-      </w:pPr>
-      <w:r>
-        <w:rPr>
+          <w:rFonts w:ascii="Times New Roman" w:hAnsi="Times New Roman" w:eastAsia="Times New Roman" w:cs="Times New Roman"/>
           <w:b/>
         </w:rPr>
-        <w:t>JME Cross-Language SDK Ecosystem</w:t>
+        <w:t>Hindu Scriptures: Digital Repository &amp; AI Scholar</w:t>
       </w:r>
       <w:r>
         <w:tab/>
       </w:r>
-      <w:hyperlink r:id="rId14">
+      <w:hyperlink r:id="rId20">
         <w:r>
           <w:rPr>
-            <w:color w:val="0046B4"/>
-            <w:u w:val="single"/>
-          </w:rPr>
-          <w:t>GitHub (PHP)</w:t>
-        </w:r>
-      </w:hyperlink>
-      <w:r>
-        <w:t xml:space="preserve"> | </w:t>
-      </w:r>
-      <w:hyperlink r:id="rId15">
-        <w:r>
-          <w:rPr>
-            <w:color w:val="0046B4"/>
-            <w:u w:val="single"/>
-          </w:rPr>
-          <w:t>GitHub (Python)</w:t>
-        </w:r>
-      </w:hyperlink>
-      <w:r>
-        <w:t xml:space="preserve"> | </w:t>
-      </w:r>
-      <w:hyperlink r:id="rId16">
-        <w:r>
-          <w:rPr>
-            <w:color w:val="0046B4"/>
-            <w:u w:val="single"/>
-          </w:rPr>
-          <w:t>GitHub (Dart)</w:t>
-        </w:r>
-      </w:hyperlink>
-    </w:p>
-    <w:p>
-      <w:pPr>
-        <w:keepNext/>
-        <w:spacing w:after="80" w:line="240" w:lineRule="auto"/>
-        <w:ind w:left="0"/>
-      </w:pPr>
-      <w:r>
-        <w:rPr>
-          <w:i/>
-          <w:sz w:val="20"/>
-        </w:rPr>
-        <w:t>PHP, Python, Dart, C</w:t>
-      </w:r>
-    </w:p>
-    <w:p>
-      <w:pPr>
-        <w:spacing w:after="40" w:before="0" w:line="240" w:lineRule="auto"/>
-        <w:ind w:left="360" w:hanging="216"/>
-      </w:pPr>
-      <w:r>
-        <w:rPr>
-          <w:sz w:val="20"/>
-        </w:rPr>
-        <w:t>•</w:t>
-        <w:tab/>
-        <w:t>Published native bindings and packaged runtimes across PHP, Python, and Flutter/Dart.</w:t>
-      </w:r>
-    </w:p>
-    <w:p>
-      <w:pPr>
-        <w:spacing w:after="40" w:before="0" w:line="240" w:lineRule="auto"/>
-        <w:ind w:left="360" w:hanging="216"/>
-      </w:pPr>
-      <w:r>
-        <w:rPr>
-          <w:sz w:val="20"/>
-        </w:rPr>
-        <w:t>•</w:t>
-        <w:tab/>
-        <w:t>Delivered consistent access to the same C API across multiple programming languages and operating systems.</w:t>
-      </w:r>
-    </w:p>
-    <w:p>
-      <w:pPr>
-        <w:spacing w:after="40" w:before="0" w:line="240" w:lineRule="auto"/>
-        <w:ind w:left="360" w:hanging="216"/>
-      </w:pPr>
-      <w:r>
-        <w:rPr>
-          <w:sz w:val="20"/>
-        </w:rPr>
-        <w:t>•</w:t>
-        <w:tab/>
-        <w:t>Eliminated manual compilation by distributing platform-specific binaries for end users.</w:t>
-      </w:r>
-    </w:p>
-    <w:p>
-      <w:pPr>
-        <w:keepNext/>
-        <w:tabs>
-          <w:tab w:pos="10181" w:val="right"/>
-        </w:tabs>
-        <w:spacing w:before="280" w:after="0" w:line="240" w:lineRule="auto"/>
-        <w:ind w:left="0"/>
-      </w:pPr>
-      <w:r>
-        <w:rPr>
-          <w:b/>
-        </w:rPr>
-        <w:t>Hindu Scriptures</w:t>
-      </w:r>
-      <w:r>
-        <w:tab/>
-      </w:r>
-      <w:hyperlink r:id="rId17">
-        <w:r>
-          <w:rPr>
-            <w:color w:val="0046B4"/>
-            <w:u w:val="single"/>
-          </w:rPr>
-          <w:t>GitHub</w:t>
-        </w:r>
-      </w:hyperlink>
-      <w:r>
-        <w:t xml:space="preserve"> | </w:t>
-      </w:r>
-      <w:hyperlink r:id="rId18">
-        <w:r>
-          <w:rPr>
-            <w:color w:val="0046B4"/>
-            <w:u w:val="single"/>
-          </w:rPr>
-          <w:t>Live demo</w:t>
-        </w:r>
-      </w:hyperlink>
-    </w:p>
-    <w:p>
-      <w:pPr>
-        <w:keepNext/>
-        <w:spacing w:after="80" w:line="240" w:lineRule="auto"/>
-        <w:ind w:left="0"/>
-      </w:pPr>
-      <w:r>
-        <w:rPr>
-          <w:i/>
-          <w:sz w:val="20"/>
-        </w:rPr>
-        <w:t>Node.js, Express.js, JavaScript, Google Gemini AI, Java</w:t>
-      </w:r>
-    </w:p>
-    <w:p>
-      <w:pPr>
-        <w:spacing w:after="40" w:before="0" w:line="240" w:lineRule="auto"/>
-        <w:ind w:left="360" w:hanging="216"/>
-      </w:pPr>
-      <w:r>
-        <w:rPr>
-          <w:sz w:val="20"/>
-        </w:rPr>
-        <w:t>•</w:t>
-        <w:tab/>
-        <w:t>Built a full-text scripture search platform with AI-powered search via Google Gemini 2.5 Flash API and URL-rewriting-based multilingual translation through Google Translate.</w:t>
-      </w:r>
-    </w:p>
-    <w:p>
-      <w:pPr>
-        <w:spacing w:after="40" w:before="0" w:line="240" w:lineRule="auto"/>
-        <w:ind w:left="360" w:hanging="216"/>
-      </w:pPr>
-      <w:r>
-        <w:rPr>
-          <w:sz w:val="20"/>
-        </w:rPr>
-        <w:t>•</w:t>
-        <w:tab/>
-        <w:t>Delivered both a web app and an Android WebView app, serving original Devanagari content with on-demand translation to multiple languages.</w:t>
-      </w:r>
-    </w:p>
-    <w:p>
-      <w:pPr>
-        <w:keepNext/>
-        <w:tabs>
-          <w:tab w:pos="10181" w:val="right"/>
-        </w:tabs>
-        <w:spacing w:before="280" w:after="0" w:line="240" w:lineRule="auto"/>
-        <w:ind w:left="0"/>
-      </w:pPr>
-      <w:r>
-        <w:rPr>
-          <w:b/>
-        </w:rPr>
-        <w:t>Enhanced Precision Grayscale Converter</w:t>
-      </w:r>
-      <w:r>
-        <w:tab/>
-      </w:r>
-      <w:hyperlink r:id="rId19">
-        <w:r>
-          <w:rPr>
+            <w:rStyle w:val="Style"/>
             <w:color w:val="0046B4"/>
             <w:u w:val="single"/>
           </w:rPr>
@@ -1043,71 +1148,80 @@
         </w:r>
       </w:hyperlink>
       <w:r>
+        <w:rPr>
+          <w:rFonts w:ascii="Times New Roman" w:hAnsi="Times New Roman" w:eastAsia="Times New Roman" w:cs="Times New Roman"/>
+        </w:rPr>
         <w:t xml:space="preserve"> | </w:t>
       </w:r>
-      <w:hyperlink r:id="rId20">
+      <w:hyperlink r:id="rId21">
         <w:r>
           <w:rPr>
+            <w:rStyle w:val="Style"/>
             <w:color w:val="0046B4"/>
             <w:u w:val="single"/>
           </w:rPr>
-          <w:t>Live demo</w:t>
+          <w:t>GitHub (Android)</w:t>
         </w:r>
       </w:hyperlink>
     </w:p>
     <w:p>
       <w:pPr>
-        <w:keepNext/>
-        <w:spacing w:after="80" w:line="240" w:lineRule="auto"/>
-        <w:ind w:left="0"/>
+        <w:keepNext w:val="true"/>
+        <w:spacing w:before="0" w:after="80" w:line="240" w:lineRule="auto"/>
+        <w:ind w:start="0"/>
       </w:pPr>
       <w:r>
         <w:rPr>
+          <w:rFonts w:ascii="Times New Roman" w:hAnsi="Times New Roman" w:eastAsia="Times New Roman" w:cs="Times New Roman"/>
           <w:i/>
           <w:sz w:val="20"/>
         </w:rPr>
-        <w:t>Python, FastAPI, Tailwind CSS, JavaScript, Axios</w:t>
+        <w:t>Node.js, Express 5, Google Gemini AI, JavaScript, Java (Android APK)</w:t>
       </w:r>
     </w:p>
     <w:p>
       <w:pPr>
-        <w:spacing w:after="40" w:before="0" w:line="240" w:lineRule="auto"/>
-        <w:ind w:left="360" w:hanging="216"/>
+        <w:spacing w:before="0" w:after="40" w:line="240" w:lineRule="auto"/>
+        <w:ind w:start="360" w:hanging="216"/>
       </w:pPr>
       <w:r>
         <w:rPr>
+          <w:rFonts w:ascii="Times New Roman" w:hAnsi="Times New Roman" w:eastAsia="Times New Roman" w:cs="Times New Roman"/>
           <w:sz w:val="20"/>
         </w:rPr>
         <w:t>•</w:t>
         <w:tab/>
-        <w:t>Engineered a FastAPI backend supporting 7 color-science modes (Rec.709, BT.601, BT.2100, HSL, HSV, L*a*b*, Gamma) with 8/16-bit output in PNG, JPEG, HEIC, TIFF, WEBP, and BMP.</w:t>
+        <w:t>Developed a Sanātana Dharma digital repository indexing sacred literature across the Vedas, Upanishads, Bhagavad Gita, and Puranas with verse-level lexical search and Sanskrit root morphology.</w:t>
       </w:r>
     </w:p>
     <w:p>
       <w:pPr>
-        <w:spacing w:after="40" w:before="0" w:line="240" w:lineRule="auto"/>
-        <w:ind w:left="360" w:hanging="216"/>
+        <w:spacing w:before="0" w:after="40" w:line="240" w:lineRule="auto"/>
+        <w:ind w:start="360" w:hanging="216"/>
       </w:pPr>
       <w:r>
         <w:rPr>
+          <w:rFonts w:ascii="Times New Roman" w:hAnsi="Times New Roman" w:eastAsia="Times New Roman" w:cs="Times New Roman"/>
           <w:sz w:val="20"/>
         </w:rPr>
         <w:t>•</w:t>
         <w:tab/>
-        <w:t>Developed a responsive frontend with Axios-powered live previews, drag-and-drop, and EXIF/ICC preservation toggles; fully self-hosted with no third-party uploads.</w:t>
+        <w:t>Integrated contextual AI scripture analysis using Google Gemini and delivered both a responsive web platform and a native Android application.</w:t>
       </w:r>
     </w:p>
     <w:p>
       <w:pPr>
-        <w:keepNext/>
+        <w:keepNext w:val="true"/>
         <w:tabs>
-          <w:tab w:pos="10181" w:val="right"/>
+          <w:tab w:val="clear" w:pos="720"/>
+          <w:tab w:val="right" w:pos="10181" w:leader="none"/>
         </w:tabs>
         <w:spacing w:before="280" w:after="0" w:line="240" w:lineRule="auto"/>
-        <w:ind w:left="0"/>
+        <w:ind w:start="0"/>
       </w:pPr>
       <w:r>
         <w:rPr>
+          <w:rFonts w:ascii="Times New Roman" w:hAnsi="Times New Roman" w:eastAsia="Times New Roman" w:cs="Times New Roman"/>
           <w:b/>
         </w:rPr>
         <w:t>Laravel Gemini AI Translation Extractor</w:t>
@@ -1115,9 +1229,10 @@
       <w:r>
         <w:tab/>
       </w:r>
-      <w:hyperlink r:id="rId21">
+      <w:hyperlink r:id="rId22">
         <w:r>
           <w:rPr>
+            <w:rStyle w:val="Style"/>
             <w:color w:val="0046B4"/>
             <w:u w:val="single"/>
           </w:rPr>
@@ -1127,53 +1242,73 @@
     </w:p>
     <w:p>
       <w:pPr>
-        <w:keepNext/>
-        <w:spacing w:after="80" w:line="240" w:lineRule="auto"/>
-        <w:ind w:left="0"/>
+        <w:keepNext w:val="true"/>
+        <w:spacing w:before="0" w:after="80" w:line="240" w:lineRule="auto"/>
+        <w:ind w:start="0"/>
       </w:pPr>
       <w:r>
         <w:rPr>
+          <w:rFonts w:ascii="Times New Roman" w:hAnsi="Times New Roman" w:eastAsia="Times New Roman" w:cs="Times New Roman"/>
           <w:i/>
           <w:sz w:val="20"/>
         </w:rPr>
-        <w:t>PHP, Laravel, Google Gemini AI, spatie/fork</w:t>
+        <w:t>PHP 8.3+, Laravel 11–13, Gemini AI, Fork (pcntl), Symfony Process, C kernel32 FFI</w:t>
       </w:r>
     </w:p>
     <w:p>
       <w:pPr>
-        <w:spacing w:after="40" w:before="0" w:line="240" w:lineRule="auto"/>
-        <w:ind w:left="360" w:hanging="216"/>
+        <w:spacing w:before="0" w:after="40" w:line="240" w:lineRule="auto"/>
+        <w:ind w:start="360" w:hanging="216"/>
       </w:pPr>
       <w:r>
         <w:rPr>
+          <w:rFonts w:ascii="Times New Roman" w:hAnsi="Times New Roman" w:eastAsia="Times New Roman" w:cs="Times New Roman"/>
           <w:sz w:val="20"/>
         </w:rPr>
         <w:t>•</w:t>
         <w:tab/>
-        <w:t>Developed an Artisan command that scans Blade/PHP/JS/TS sources for translation keys, generates Laravel PHP &amp; JSON language files via Gemini 2.0 Flash-Lite, and runs concurrent fork-based requests with auto-retry on rate limits.</w:t>
+        <w:t>Built an enterprise Laravel translation engine with dual-platform concurrency: Unix pcntl fork workers and Windows parallel Symfony Process workers, featuring smart token chunking, automatic rate-limit backoff, and atomic file writes.</w:t>
       </w:r>
     </w:p>
     <w:p>
       <w:pPr>
-        <w:keepNext/>
-        <w:tabs>
-          <w:tab w:pos="10181" w:val="right"/>
-        </w:tabs>
-        <w:spacing w:before="280" w:after="0" w:line="240" w:lineRule="auto"/>
-        <w:ind w:left="0"/>
+        <w:spacing w:before="0" w:after="40" w:line="240" w:lineRule="auto"/>
+        <w:ind w:start="360" w:hanging="216"/>
       </w:pPr>
       <w:r>
         <w:rPr>
+          <w:rFonts w:ascii="Times New Roman" w:hAnsi="Times New Roman" w:eastAsia="Times New Roman" w:cs="Times New Roman"/>
+          <w:sz w:val="20"/>
+        </w:rPr>
+        <w:t>•</w:t>
+        <w:tab/>
+        <w:t>Engineered a native Windows interactive TUI via C kernel32.dll FFI console hooks providing arrow-key navigation and multi-select prompts matching Laravel Prompts, alongside a web-based Translation Manager with script-fault detection across a 249-language catalog.</w:t>
+      </w:r>
+    </w:p>
+    <w:p>
+      <w:pPr>
+        <w:keepNext w:val="true"/>
+        <w:tabs>
+          <w:tab w:val="clear" w:pos="720"/>
+          <w:tab w:val="right" w:pos="10181" w:leader="none"/>
+        </w:tabs>
+        <w:spacing w:before="280" w:after="0" w:line="240" w:lineRule="auto"/>
+        <w:ind w:start="0"/>
+      </w:pPr>
+      <w:r>
+        <w:rPr>
+          <w:rFonts w:ascii="Times New Roman" w:hAnsi="Times New Roman" w:eastAsia="Times New Roman" w:cs="Times New Roman"/>
           <w:b/>
         </w:rPr>
-        <w:t>PostalKit</w:t>
+        <w:t>Poetry Analyzer — Deep Linguistic Analysis Engine</w:t>
       </w:r>
       <w:r>
         <w:tab/>
       </w:r>
-      <w:hyperlink r:id="rId22">
+      <w:hyperlink r:id="rId23">
         <w:r>
           <w:rPr>
+            <w:rStyle w:val="Style"/>
             <w:color w:val="0046B4"/>
             <w:u w:val="single"/>
           </w:rPr>
@@ -1183,53 +1318,73 @@
     </w:p>
     <w:p>
       <w:pPr>
-        <w:keepNext/>
-        <w:spacing w:after="80" w:line="240" w:lineRule="auto"/>
-        <w:ind w:left="0"/>
+        <w:keepNext w:val="true"/>
+        <w:spacing w:before="0" w:after="80" w:line="240" w:lineRule="auto"/>
+        <w:ind w:start="0"/>
       </w:pPr>
       <w:r>
         <w:rPr>
+          <w:rFonts w:ascii="Times New Roman" w:hAnsi="Times New Roman" w:eastAsia="Times New Roman" w:cs="Times New Roman"/>
           <w:i/>
           <w:sz w:val="20"/>
         </w:rPr>
-        <w:t>Python, ctypes, FFI, libpostal</w:t>
+        <w:t>Python, FastAPI, PyTorch, Transformers, spaCy, Stanza, HuggingFace, Alembic</w:t>
       </w:r>
     </w:p>
     <w:p>
       <w:pPr>
-        <w:spacing w:after="40" w:before="0" w:line="240" w:lineRule="auto"/>
-        <w:ind w:left="360" w:hanging="216"/>
+        <w:spacing w:before="0" w:after="40" w:line="240" w:lineRule="auto"/>
+        <w:ind w:start="360" w:hanging="216"/>
       </w:pPr>
       <w:r>
         <w:rPr>
+          <w:rFonts w:ascii="Times New Roman" w:hAnsi="Times New Roman" w:eastAsia="Times New Roman" w:cs="Times New Roman"/>
           <w:sz w:val="20"/>
         </w:rPr>
         <w:t>•</w:t>
         <w:tab/>
-        <w:t>Delivered a strict 1:1 ctypes wrapper for the OpenVenues libpostal C library (46 functions, 10 structs, 42 flags) with first-run auto-download of ~2 GB ML models and OS-specific binaries, bypassing all manual toolchain setup.</w:t>
+        <w:t>Designed an async FastAPI backend orchestrating 1.5 GB+ HuggingFace Transformer models, spaCy, Stanza, and Indic NLP to compute poetic meter, rhyme patterns, phonology, and semantic motifs with sub-second latency.</w:t>
       </w:r>
     </w:p>
     <w:p>
       <w:pPr>
-        <w:keepNext/>
-        <w:tabs>
-          <w:tab w:pos="10181" w:val="right"/>
-        </w:tabs>
-        <w:spacing w:before="280" w:after="0" w:line="240" w:lineRule="auto"/>
-        <w:ind w:left="0"/>
+        <w:spacing w:before="0" w:after="40" w:line="240" w:lineRule="auto"/>
+        <w:ind w:start="360" w:hanging="216"/>
       </w:pPr>
       <w:r>
         <w:rPr>
+          <w:rFonts w:ascii="Times New Roman" w:hAnsi="Times New Roman" w:eastAsia="Times New Roman" w:cs="Times New Roman"/>
+          <w:sz w:val="20"/>
+        </w:rPr>
+        <w:t>•</w:t>
+        <w:tab/>
+        <w:t>Implemented SQLAlchemy ORM connection pooling for SQLite, PostgreSQL, and MySQL, with Alembic schema migrations.</w:t>
+      </w:r>
+    </w:p>
+    <w:p>
+      <w:pPr>
+        <w:keepNext w:val="true"/>
+        <w:tabs>
+          <w:tab w:val="clear" w:pos="720"/>
+          <w:tab w:val="right" w:pos="10181" w:leader="none"/>
+        </w:tabs>
+        <w:spacing w:before="280" w:after="0" w:line="240" w:lineRule="auto"/>
+        <w:ind w:start="0"/>
+      </w:pPr>
+      <w:r>
+        <w:rPr>
+          <w:rFonts w:ascii="Times New Roman" w:hAnsi="Times New Roman" w:eastAsia="Times New Roman" w:cs="Times New Roman"/>
           <w:b/>
         </w:rPr>
-        <w:t>Literary &amp; Linguistic Poetry Analyzer</w:t>
+        <w:t>SQL to Laravel Migration Compiler</w:t>
       </w:r>
       <w:r>
         <w:tab/>
       </w:r>
-      <w:hyperlink r:id="rId23">
+      <w:hyperlink r:id="rId24">
         <w:r>
           <w:rPr>
+            <w:rStyle w:val="Style"/>
             <w:color w:val="0046B4"/>
             <w:u w:val="single"/>
           </w:rPr>
@@ -1239,248 +1394,45 @@
     </w:p>
     <w:p>
       <w:pPr>
-        <w:keepNext/>
-        <w:spacing w:after="80" w:line="240" w:lineRule="auto"/>
-        <w:ind w:left="0"/>
+        <w:keepNext w:val="true"/>
+        <w:spacing w:before="0" w:after="80" w:line="240" w:lineRule="auto"/>
+        <w:ind w:start="0"/>
       </w:pPr>
       <w:r>
         <w:rPr>
+          <w:rFonts w:ascii="Times New Roman" w:hAnsi="Times New Roman" w:eastAsia="Times New Roman" w:cs="Times New Roman"/>
           <w:i/>
           <w:sz w:val="20"/>
         </w:rPr>
-        <w:t>Python, FastAPI, PyTorch, HuggingFace</w:t>
+        <w:t>JavaScript, Web Workers, Topological Sort, Laravel 11/12/13</w:t>
       </w:r>
     </w:p>
     <w:p>
       <w:pPr>
-        <w:spacing w:after="40" w:before="0" w:line="240" w:lineRule="auto"/>
-        <w:ind w:left="360" w:hanging="216"/>
+        <w:spacing w:before="0" w:after="40" w:line="240" w:lineRule="auto"/>
+        <w:ind w:start="360" w:hanging="216"/>
       </w:pPr>
       <w:r>
         <w:rPr>
+          <w:rFonts w:ascii="Times New Roman" w:hAnsi="Times New Roman" w:eastAsia="Times New Roman" w:cs="Times New Roman"/>
           <w:sz w:val="20"/>
         </w:rPr>
         <w:t>•</w:t>
         <w:tab/>
-        <w:t>Designed an async FastAPI backend orchestrating 1.5 GB+ HuggingFace Transformer models, spaCy, NLTK, and Stanza for multilingual sentiment, emotion, and phonological classification.</w:t>
+        <w:t>Built a privacy-first, client-side compiler transforming raw SQL database dumps into idiomatic Laravel 11–13 migrations and seeders with topological foreign-key dependency resolution, vector/spatial type mapping, and environment-aware dialect generation across MySQL, PostgreSQL, MariaDB, and SQLite.</w:t>
       </w:r>
     </w:p>
     <w:p>
       <w:pPr>
-        <w:spacing w:after="40" w:before="0" w:line="240" w:lineRule="auto"/>
-        <w:ind w:left="360" w:hanging="216"/>
+        <w:keepNext w:val="true"/>
+        <w:pBdr>
+          <w:bottom w:val="single" w:sz="6" w:space="1" w:color="000000"/>
+        </w:pBdr>
+        <w:spacing w:before="280" w:after="80" w:line="240" w:lineRule="auto"/>
       </w:pPr>
       <w:r>
         <w:rPr>
-          <w:sz w:val="20"/>
-        </w:rPr>
-        <w:t>•</w:t>
-        <w:tab/>
-        <w:t>Implemented SQLAlchemy ORM connection pooling for SQLite, PostgreSQL, and MySQL/MariaDB, with Alembic schema migrations for production-ready scalability.</w:t>
-      </w:r>
-    </w:p>
-    <w:p>
-      <w:pPr>
-        <w:keepNext/>
-        <w:tabs>
-          <w:tab w:pos="10181" w:val="right"/>
-        </w:tabs>
-        <w:spacing w:before="280" w:after="0" w:line="240" w:lineRule="auto"/>
-        <w:ind w:left="0"/>
-      </w:pPr>
-      <w:r>
-        <w:rPr>
-          <w:b/>
-        </w:rPr>
-        <w:t>Crop &amp; Nutrient Recommendations Apps</w:t>
-      </w:r>
-      <w:r>
-        <w:tab/>
-      </w:r>
-      <w:hyperlink r:id="rId24">
-        <w:r>
-          <w:rPr>
-            <w:color w:val="0046B4"/>
-            <w:u w:val="single"/>
-          </w:rPr>
-          <w:t>GitHub (Crop)</w:t>
-        </w:r>
-      </w:hyperlink>
-      <w:r>
-        <w:t xml:space="preserve"> | </w:t>
-      </w:r>
-      <w:hyperlink r:id="rId25">
-        <w:r>
-          <w:rPr>
-            <w:color w:val="0046B4"/>
-            <w:u w:val="single"/>
-          </w:rPr>
-          <w:t>GitHub (Nutrient)</w:t>
-        </w:r>
-      </w:hyperlink>
-    </w:p>
-    <w:p>
-      <w:pPr>
-        <w:keepNext/>
-        <w:spacing w:after="80" w:line="240" w:lineRule="auto"/>
-        <w:ind w:left="0"/>
-      </w:pPr>
-      <w:r>
-        <w:rPr>
-          <w:i/>
-          <w:sz w:val="20"/>
-        </w:rPr>
-        <w:t>Python, Flask, Google Gemini AI, HTML, CSS, JavaScript</w:t>
-      </w:r>
-    </w:p>
-    <w:p>
-      <w:pPr>
-        <w:spacing w:after="40" w:before="0" w:line="240" w:lineRule="auto"/>
-        <w:ind w:left="360" w:hanging="216"/>
-      </w:pPr>
-      <w:r>
-        <w:rPr>
-          <w:sz w:val="20"/>
-        </w:rPr>
-        <w:t>•</w:t>
-        <w:tab/>
-        <w:t>Built two Flask applications powered by Google Gemini 2.0 Flash Lite: one recommending crops by factoring in weather, soil, and water needs; the other generating personalized daily caloric and nutrient targets from user biometric inputs.</w:t>
-      </w:r>
-    </w:p>
-    <w:p>
-      <w:pPr>
-        <w:keepNext/>
-        <w:tabs>
-          <w:tab w:pos="10181" w:val="right"/>
-        </w:tabs>
-        <w:spacing w:before="280" w:after="0" w:line="240" w:lineRule="auto"/>
-        <w:ind w:left="0"/>
-      </w:pPr>
-      <w:r>
-        <w:rPr>
-          <w:b/>
-        </w:rPr>
-        <w:t>Recipe App</w:t>
-      </w:r>
-      <w:r>
-        <w:tab/>
-      </w:r>
-      <w:hyperlink r:id="rId26">
-        <w:r>
-          <w:rPr>
-            <w:color w:val="0046B4"/>
-            <w:u w:val="single"/>
-          </w:rPr>
-          <w:t>GitHub</w:t>
-        </w:r>
-      </w:hyperlink>
-    </w:p>
-    <w:p>
-      <w:pPr>
-        <w:keepNext/>
-        <w:spacing w:after="80" w:line="240" w:lineRule="auto"/>
-        <w:ind w:left="0"/>
-      </w:pPr>
-      <w:r>
-        <w:rPr>
-          <w:i/>
-          <w:sz w:val="20"/>
-        </w:rPr>
-        <w:t>Flutter</w:t>
-      </w:r>
-    </w:p>
-    <w:p>
-      <w:pPr>
-        <w:spacing w:after="40" w:before="0" w:line="240" w:lineRule="auto"/>
-        <w:ind w:left="360" w:hanging="216"/>
-      </w:pPr>
-      <w:r>
-        <w:rPr>
-          <w:sz w:val="20"/>
-        </w:rPr>
-        <w:t>•</w:t>
-        <w:tab/>
-        <w:t>Built a cross-platform Flutter recipe browser with search, filtering, and a user-friendly detail view.</w:t>
-      </w:r>
-    </w:p>
-    <w:p>
-      <w:pPr>
-        <w:keepNext/>
-        <w:tabs>
-          <w:tab w:pos="10181" w:val="right"/>
-        </w:tabs>
-        <w:spacing w:before="280" w:after="0" w:line="240" w:lineRule="auto"/>
-        <w:ind w:left="0"/>
-      </w:pPr>
-      <w:r>
-        <w:rPr>
-          <w:b/>
-        </w:rPr>
-        <w:t>Portfolio</w:t>
-      </w:r>
-      <w:r>
-        <w:tab/>
-      </w:r>
-      <w:hyperlink r:id="rId27">
-        <w:r>
-          <w:rPr>
-            <w:color w:val="0046B4"/>
-            <w:u w:val="single"/>
-          </w:rPr>
-          <w:t>GitHub</w:t>
-        </w:r>
-      </w:hyperlink>
-      <w:r>
-        <w:t xml:space="preserve"> | </w:t>
-      </w:r>
-      <w:hyperlink r:id="rId28">
-        <w:r>
-          <w:rPr>
-            <w:color w:val="0046B4"/>
-            <w:u w:val="single"/>
-          </w:rPr>
-          <w:t>Live demo</w:t>
-        </w:r>
-      </w:hyperlink>
-    </w:p>
-    <w:p>
-      <w:pPr>
-        <w:keepNext/>
-        <w:spacing w:after="80" w:line="240" w:lineRule="auto"/>
-        <w:ind w:left="0"/>
-      </w:pPr>
-      <w:r>
-        <w:rPr>
-          <w:i/>
-          <w:sz w:val="20"/>
-        </w:rPr>
-        <w:t>HTML, CSS, JavaScript, Tailwind CSS</w:t>
-      </w:r>
-    </w:p>
-    <w:p>
-      <w:pPr>
-        <w:spacing w:after="40" w:before="0" w:line="240" w:lineRule="auto"/>
-        <w:ind w:left="360" w:hanging="216"/>
-      </w:pPr>
-      <w:r>
-        <w:rPr>
-          <w:sz w:val="20"/>
-        </w:rPr>
-        <w:t>•</w:t>
-        <w:tab/>
-        <w:t>Designed and deployed a personal portfolio showcasing projects, skills, and professional background.</w:t>
-      </w:r>
-    </w:p>
-    <w:p>
-      <w:pPr>
-        <w:keepNext/>
-        <w:spacing w:before="280" w:after="80" w:line="240" w:lineRule="auto"/>
-        <w:pBdr>
-          <w:bottom w:val="single" w:sz="6" w:space="1" w:color="000000"/>
-        </w:pBdr>
-      </w:pPr>
-      <w:r>
-        <w:rPr>
+          <w:rFonts w:ascii="Times New Roman" w:hAnsi="Times New Roman" w:eastAsia="Times New Roman" w:cs="Times New Roman"/>
           <w:b/>
           <w:sz w:val="24"/>
         </w:rPr>
@@ -1489,63 +1441,81 @@
     </w:p>
     <w:p>
       <w:pPr>
-        <w:keepNext/>
+        <w:keepNext w:val="true"/>
         <w:tabs>
-          <w:tab w:pos="10181" w:val="right"/>
+          <w:tab w:val="clear" w:pos="720"/>
+          <w:tab w:val="right" w:pos="10181" w:leader="none"/>
         </w:tabs>
-        <w:spacing w:before="240" w:after="0" w:line="240" w:lineRule="auto"/>
-        <w:ind w:left="0"/>
+        <w:spacing w:before="0" w:after="0" w:line="240" w:lineRule="auto"/>
+        <w:ind w:start="0"/>
       </w:pPr>
       <w:r>
         <w:rPr>
+          <w:rFonts w:ascii="Times New Roman" w:hAnsi="Times New Roman" w:eastAsia="Times New Roman" w:cs="Times New Roman"/>
           <w:b/>
         </w:rPr>
         <w:t>Parul University</w:t>
       </w:r>
       <w:r>
         <w:tab/>
+      </w:r>
+      <w:r>
+        <w:rPr>
+          <w:rFonts w:ascii="Times New Roman" w:hAnsi="Times New Roman" w:eastAsia="Times New Roman" w:cs="Times New Roman"/>
+        </w:rPr>
         <w:t>Vadodara, Gujarat, India</w:t>
       </w:r>
     </w:p>
     <w:p>
       <w:pPr>
-        <w:keepNext/>
+        <w:keepNext w:val="true"/>
         <w:tabs>
-          <w:tab w:pos="10181" w:val="right"/>
+          <w:tab w:val="clear" w:pos="720"/>
+          <w:tab w:val="right" w:pos="10181" w:leader="none"/>
         </w:tabs>
-        <w:spacing w:after="0" w:line="240" w:lineRule="auto"/>
-        <w:ind w:left="0"/>
+        <w:spacing w:before="0" w:after="0" w:line="240" w:lineRule="auto"/>
+        <w:ind w:start="0"/>
       </w:pPr>
       <w:r>
         <w:rPr>
+          <w:rFonts w:ascii="Times New Roman" w:hAnsi="Times New Roman" w:eastAsia="Times New Roman" w:cs="Times New Roman"/>
           <w:i/>
         </w:rPr>
         <w:t>B.Tech in Computer Science and Engineering</w:t>
       </w:r>
       <w:r>
         <w:tab/>
+      </w:r>
+      <w:r>
+        <w:rPr>
+          <w:rFonts w:ascii="Times New Roman" w:hAnsi="Times New Roman" w:eastAsia="Times New Roman" w:cs="Times New Roman"/>
+        </w:rPr>
         <w:t>2021 – 2025</w:t>
       </w:r>
     </w:p>
     <w:p>
       <w:pPr>
-        <w:spacing w:after="80"/>
-        <w:ind w:left="0"/>
+        <w:spacing w:before="0" w:after="40"/>
+        <w:ind w:start="0"/>
       </w:pPr>
       <w:r>
+        <w:rPr>
+          <w:rFonts w:ascii="Times New Roman" w:hAnsi="Times New Roman" w:eastAsia="Times New Roman" w:cs="Times New Roman"/>
+        </w:rPr>
         <w:t>CGPA: 7.29</w:t>
       </w:r>
     </w:p>
     <w:p>
       <w:pPr>
-        <w:keepNext/>
-        <w:spacing w:before="280" w:after="80" w:line="240" w:lineRule="auto"/>
+        <w:keepNext w:val="true"/>
         <w:pBdr>
           <w:bottom w:val="single" w:sz="6" w:space="1" w:color="000000"/>
         </w:pBdr>
+        <w:spacing w:before="280" w:after="80" w:line="240" w:lineRule="auto"/>
       </w:pPr>
       <w:r>
         <w:rPr>
+          <w:rFonts w:ascii="Times New Roman" w:hAnsi="Times New Roman" w:eastAsia="Times New Roman" w:cs="Times New Roman"/>
           <w:b/>
           <w:sz w:val="24"/>
         </w:rPr>
@@ -1554,16 +1524,17 @@
     </w:p>
     <w:p>
       <w:pPr>
-        <w:spacing w:after="40" w:before="0" w:line="240" w:lineRule="auto"/>
-        <w:ind w:left="360" w:hanging="216"/>
+        <w:spacing w:before="0" w:after="40" w:line="240" w:lineRule="auto"/>
+        <w:ind w:start="360" w:hanging="216"/>
       </w:pPr>
       <w:r>
         <w:t>•</w:t>
         <w:tab/>
       </w:r>
-      <w:hyperlink r:id="rId29">
+      <w:hyperlink r:id="rId25">
         <w:r>
           <w:rPr>
+            <w:rStyle w:val="Style"/>
             <w:color w:val="0046B4"/>
             <w:u w:val="single"/>
           </w:rPr>
@@ -1573,16 +1544,17 @@
     </w:p>
     <w:p>
       <w:pPr>
-        <w:spacing w:after="40" w:before="0" w:line="240" w:lineRule="auto"/>
-        <w:ind w:left="360" w:hanging="216"/>
+        <w:spacing w:before="0" w:after="40" w:line="240" w:lineRule="auto"/>
+        <w:ind w:start="360" w:hanging="216"/>
       </w:pPr>
       <w:r>
         <w:t>•</w:t>
         <w:tab/>
       </w:r>
-      <w:hyperlink r:id="rId30">
+      <w:hyperlink r:id="rId26">
         <w:r>
           <w:rPr>
+            <w:rStyle w:val="Style"/>
             <w:color w:val="0046B4"/>
             <w:u w:val="single"/>
           </w:rPr>
@@ -1592,16 +1564,17 @@
     </w:p>
     <w:p>
       <w:pPr>
-        <w:spacing w:after="40" w:before="0" w:line="240" w:lineRule="auto"/>
-        <w:ind w:left="360" w:hanging="216"/>
+        <w:spacing w:before="0" w:after="40" w:line="240" w:lineRule="auto"/>
+        <w:ind w:start="360" w:hanging="216"/>
       </w:pPr>
       <w:r>
         <w:t>•</w:t>
         <w:tab/>
       </w:r>
-      <w:hyperlink r:id="rId31">
+      <w:hyperlink r:id="rId27">
         <w:r>
           <w:rPr>
+            <w:rStyle w:val="Style"/>
             <w:color w:val="0046B4"/>
             <w:u w:val="single"/>
           </w:rPr>
@@ -1611,16 +1584,17 @@
     </w:p>
     <w:p>
       <w:pPr>
-        <w:spacing w:after="40" w:before="0" w:line="240" w:lineRule="auto"/>
-        <w:ind w:left="360" w:hanging="216"/>
+        <w:spacing w:before="0" w:after="40" w:line="240" w:lineRule="auto"/>
+        <w:ind w:start="360" w:hanging="216"/>
       </w:pPr>
       <w:r>
         <w:t>•</w:t>
         <w:tab/>
       </w:r>
-      <w:hyperlink r:id="rId32">
+      <w:hyperlink r:id="rId28">
         <w:r>
           <w:rPr>
+            <w:rStyle w:val="Style"/>
             <w:color w:val="0046B4"/>
             <w:u w:val="single"/>
           </w:rPr>
@@ -1630,16 +1604,17 @@
     </w:p>
     <w:p>
       <w:pPr>
-        <w:spacing w:after="40" w:before="0" w:line="240" w:lineRule="auto"/>
-        <w:ind w:left="360" w:hanging="216"/>
+        <w:spacing w:before="0" w:after="40" w:line="240" w:lineRule="auto"/>
+        <w:ind w:start="360" w:hanging="216"/>
       </w:pPr>
       <w:r>
         <w:t>•</w:t>
         <w:tab/>
       </w:r>
-      <w:hyperlink r:id="rId33">
+      <w:hyperlink r:id="rId29">
         <w:r>
           <w:rPr>
+            <w:rStyle w:val="Style"/>
             <w:color w:val="0046B4"/>
             <w:u w:val="single"/>
           </w:rPr>
@@ -1649,16 +1624,17 @@
     </w:p>
     <w:p>
       <w:pPr>
-        <w:spacing w:after="40" w:before="0" w:line="240" w:lineRule="auto"/>
-        <w:ind w:left="360" w:hanging="216"/>
+        <w:spacing w:before="0" w:after="40" w:line="240" w:lineRule="auto"/>
+        <w:ind w:start="360" w:hanging="216"/>
       </w:pPr>
       <w:r>
         <w:t>•</w:t>
         <w:tab/>
       </w:r>
-      <w:hyperlink r:id="rId34">
+      <w:hyperlink r:id="rId30">
         <w:r>
           <w:rPr>
+            <w:rStyle w:val="Style"/>
             <w:color w:val="0046B4"/>
             <w:u w:val="single"/>
           </w:rPr>
@@ -1668,14 +1644,15 @@
     </w:p>
     <w:p>
       <w:pPr>
-        <w:keepNext/>
-        <w:spacing w:before="280" w:after="80" w:line="240" w:lineRule="auto"/>
+        <w:keepNext w:val="true"/>
         <w:pBdr>
           <w:bottom w:val="single" w:sz="6" w:space="1" w:color="000000"/>
         </w:pBdr>
+        <w:spacing w:before="280" w:after="80" w:line="240" w:lineRule="auto"/>
       </w:pPr>
       <w:r>
         <w:rPr>
+          <w:rFonts w:ascii="Times New Roman" w:hAnsi="Times New Roman" w:eastAsia="Times New Roman" w:cs="Times New Roman"/>
           <w:b/>
           <w:sz w:val="24"/>
         </w:rPr>
@@ -1684,16 +1661,19 @@
     </w:p>
     <w:p>
       <w:pPr>
-        <w:spacing w:before="80" w:line="240" w:lineRule="auto"/>
-        <w:ind w:left="0"/>
+        <w:spacing w:before="0" w:after="0" w:line="240" w:lineRule="auto"/>
+        <w:ind w:start="0"/>
       </w:pPr>
       <w:r>
-        <w:t>Analytical Thinking, Problem Solving, Attention to Detail, Research, Time Management, Adaptability, Communication, Teamwork, Leadership</w:t>
+        <w:rPr>
+          <w:rFonts w:ascii="Times New Roman" w:hAnsi="Times New Roman" w:eastAsia="Times New Roman" w:cs="Times New Roman"/>
+        </w:rPr>
+        <w:t>Analytical Thinking, Problem Solving, Systems Architecture, Attention to Detail, Technical Research, Time Management, Adaptability, Communication, Teamwork, Leadership</w:t>
       </w:r>
     </w:p>
     <w:sectPr>
-      <w:pgSz w:w="11909" w:h="16834"/>
-      <w:pgMar w:top="864" w:right="864" w:bottom="864" w:left="864" w:header="720" w:footer="720" w:gutter="0"/>
+      <w:pgSz w:w="11906" w:h="16838"/>
+      <w:pgMar w:top="864" w:right="864" w:bottom="864" w:left="864" w:header="0" w:footer="0" w:gutter="0"/>
       <w:cols w:space="720"/>
       <w:docGrid w:linePitch="360"/>
     </w:sectPr>
@@ -1909,7 +1889,7 @@
   <w:docDefaults>
     <w:rPrDefault>
       <w:rPr>
-        <w:rFonts w:asciiTheme="minorHAnsi" w:eastAsiaTheme="minorEastAsia" w:hAnsiTheme="minorHAnsi" w:cstheme="minorBidi"/>
+        <w:rFonts w:asciiTheme="minorHAnsi" w:eastAsiaTheme="minorEastAsia" w:hAnsiTheme="minorHAnsi" w:cstheme="minorBidi" w:ascii="Times New Roman" w:hAnsi="Times New Roman" w:eastAsia="Times New Roman" w:cs="Times New Roman"/>
         <w:sz w:val="22"/>
         <w:szCs w:val="22"/>
         <w:lang w:val="en-US" w:eastAsia="en-US" w:bidi="ar-SA"/>
@@ -2065,11 +2045,12 @@
     <w:qFormat/>
     <w:rsid w:val="00FC693F"/>
     <w:pPr>
-      <w:spacing w:line="240" w:lineRule="auto" w:after="0"/>
+      <w:spacing w:before="0" w:after="0" w:line="240" w:lineRule="auto"/>
     </w:pPr>
     <w:rPr>
-      <w:rFonts w:ascii="Times New Roman" w:hAnsi="Times New Roman"/>
+      <w:rFonts w:ascii="Times New Roman" w:hAnsi="Times New Roman" w:eastAsia="Times New Roman" w:cs="Times New Roman"/>
       <w:sz w:val="22"/>
+      <w:color w:val="auto"/>
     </w:rPr>
   </w:style>
   <w:style w:type="paragraph" w:styleId="Header">

</xml_diff>